<commit_message>
Updated with more models
</commit_message>
<xml_diff>
--- a/reports/SBA_LendWise_Report.docx
+++ b/reports/SBA_LendWise_Report.docx
@@ -4,172 +4,61 @@
   <w:body>
     <w:p>
       <w:pPr>
-        <w:pStyle w:val="Title"/>
-        <w:spacing w:after="360"/>
         <w:jc w:val="center"/>
       </w:pPr>
       <w:r>
-        <w:t>CSE 587B - Project Phase 1 and Phase 2</w:t>
+        <w:rPr>
+          <w:b/>
+          <w:sz w:val="40"/>
+        </w:rPr>
+        <w:t>LendWise: SBA Approved Loan Amount Prediction</w:t>
       </w:r>
     </w:p>
     <w:p>
       <w:pPr>
-        <w:spacing w:after="160"/>
+        <w:jc w:val="center"/>
+      </w:pPr>
+      <w:r>
+        <w:rPr>
+          <w:i/>
+        </w:rPr>
+        <w:t>AI Final Project Report</w:t>
+      </w:r>
+    </w:p>
+    <w:p>
+      <w:pPr>
+        <w:jc w:val="center"/>
+      </w:pPr>
+      <w:r>
+        <w:t>Student: Deepak</w:t>
+        <w:br/>
+      </w:r>
+      <w:r>
+        <w:t>Course: CS5100 / CSE 587B Final Project</w:t>
+        <w:br/>
+      </w:r>
+      <w:r>
+        <w:t>Date: August 7, 2026</w:t>
+        <w:br/>
+      </w:r>
+      <w:r>
+        <w:t>Dataset: SBA National Loan Dataset</w:t>
+        <w:br/>
+      </w:r>
+      <w:r>
+        <w:t>Target: GrAppv, the gross approved loan amount</w:t>
+      </w:r>
+    </w:p>
+    <w:p/>
+    <w:p>
+      <w:pPr>
+        <w:jc w:val="center"/>
       </w:pPr>
       <w:r>
         <w:rPr>
           <w:b/>
         </w:rPr>
-        <w:t xml:space="preserve">Title: </w:t>
-      </w:r>
-      <w:r>
-        <w:t>LendWise - SBA Approved Loan Amount Prediction</w:t>
-      </w:r>
-    </w:p>
-    <w:p>
-      <w:pPr>
-        <w:spacing w:after="160"/>
-      </w:pPr>
-      <w:r>
-        <w:rPr>
-          <w:b/>
-        </w:rPr>
-        <w:t xml:space="preserve">Dataset: </w:t>
-      </w:r>
-      <w:r>
-        <w:t>SBA National Loan Dataset</w:t>
-      </w:r>
-    </w:p>
-    <w:p>
-      <w:pPr>
-        <w:spacing w:after="160"/>
-      </w:pPr>
-      <w:r>
-        <w:rPr>
-          <w:b/>
-        </w:rPr>
-        <w:t xml:space="preserve">Target: </w:t>
-      </w:r>
-      <w:r>
-        <w:t>GrAppv, the gross approved loan amount</w:t>
-      </w:r>
-    </w:p>
-    <w:p>
-      <w:pPr>
-        <w:spacing w:after="160"/>
-      </w:pPr>
-      <w:r>
-        <w:rPr>
-          <w:b/>
-        </w:rPr>
-        <w:t xml:space="preserve">Date: </w:t>
-      </w:r>
-      <w:r>
-        <w:t>August 7, 2026</w:t>
-      </w:r>
-    </w:p>
-    <w:p>
-      <w:pPr>
-        <w:pStyle w:val="Heading1"/>
-      </w:pPr>
-      <w:r>
-        <w:t>Problem Statement:</w:t>
-      </w:r>
-    </w:p>
-    <w:p>
-      <w:pPr>
-        <w:spacing w:after="160"/>
-        <w:jc w:val="both"/>
-      </w:pPr>
-      <w:r>
-        <w:t>The goal of this project is to predict the approved loan amount for small business loans using the SBA National dataset. The target variable is GrAppv, which represents the gross amount approved by the bank. This keeps the project as a regression problem, but changes the business context from personal or property loan sanctioning to small business lending.</w:t>
-      </w:r>
-    </w:p>
-    <w:p>
-      <w:pPr>
-        <w:spacing w:after="160"/>
-        <w:jc w:val="both"/>
-      </w:pPr>
-      <w:r>
-        <w:t>This version of LendWise is focused on estimating how much money may be approved, not whether a borrower will default. That distinction is important because default fields such as MIS_Status and ChgOffPrinGr describe loan performance after approval and should not be used to predict the approval amount.</w:t>
-      </w:r>
-    </w:p>
-    <w:p>
-      <w:pPr>
-        <w:pStyle w:val="Heading1"/>
-      </w:pPr>
-      <w:r>
-        <w:t>The problem and why we need to investigate it:</w:t>
-      </w:r>
-    </w:p>
-    <w:p>
-      <w:pPr>
-        <w:spacing w:after="160"/>
-        <w:jc w:val="both"/>
-      </w:pPr>
-      <w:r>
-        <w:t>Loan approval is usually influenced by many related factors: the business location, industry, number of employees, loan term, bank, program type, and whether the business is new or existing. A data-driven estimate can make the early loan screening process more transparent and can help borrowers and lenders understand typical approved amount patterns across similar SBA loans.</w:t>
-      </w:r>
-    </w:p>
-    <w:p>
-      <w:pPr>
-        <w:spacing w:after="160"/>
-        <w:jc w:val="both"/>
-      </w:pPr>
-      <w:r>
-        <w:t>The SBA dataset is useful for this question because it contains many years of lending records across banks, states, industries, loan terms, and business profiles. The dataset does not include every ideal borrower attribute, such as credit score or revenue, so the model is best understood as an approval amount estimator based on the available SBA loan record fields.</w:t>
-      </w:r>
-    </w:p>
-    <w:p>
-      <w:pPr>
-        <w:pStyle w:val="Heading1"/>
-      </w:pPr>
-      <w:r>
-        <w:t>Impact of the project and why our contribution is valuable:</w:t>
-      </w:r>
-    </w:p>
-    <w:p>
-      <w:pPr>
-        <w:spacing w:after="160"/>
-        <w:jc w:val="both"/>
-      </w:pPr>
-      <w:r>
-        <w:t>A model that predicts approved loan amount can support faster preliminary decisions. It can help borrowers form realistic expectations and help lenders identify records that may need closer review. Even if the final approval process remains manual, this model gives a quick statistical estimate that can be compared with the actual requested or approved amount.</w:t>
-      </w:r>
-    </w:p>
-    <w:p>
-      <w:pPr>
-        <w:spacing w:after="160"/>
-        <w:jc w:val="both"/>
-      </w:pPr>
-      <w:r>
-        <w:t>In this project, the best model was LightGBM, with a test RMSE of $190,979, MAE of $102,262, and R2 of 0.544. The error is still large in dollar terms, but it is a clear improvement over the dummy baseline and shows that the available SBA fields do contain useful signal.</w:t>
-      </w:r>
-    </w:p>
-    <w:p>
-      <w:pPr>
-        <w:pStyle w:val="Heading1"/>
-      </w:pPr>
-      <w:r>
-        <w:t>Data Source:</w:t>
-      </w:r>
-    </w:p>
-    <w:p>
-      <w:pPr>
-        <w:spacing w:after="160"/>
-        <w:jc w:val="left"/>
-      </w:pPr>
-      <w:r>
-        <w:t>Kaggle SBA National Dataset: https://www.kaggle.com/datasets/maddraf/sbanational-csv</w:t>
-      </w:r>
-    </w:p>
-    <w:p>
-      <w:pPr>
-        <w:spacing w:after="160"/>
-        <w:jc w:val="both"/>
-      </w:pPr>
-      <w:r>
-        <w:t>The raw file used in the notebook is src/data/SBAnational.csv. It contains 899,164 rows and 27 columns before cleaning. After target cleanup and preprocessing checks, 899,164 rows remain for analysis and modeling.</w:t>
+        <w:t>Best model: LightGBM | RMSE $184,928 | MAE $98,792 | R2 0.572</w:t>
       </w:r>
     </w:p>
     <w:p>
@@ -182,7 +71,7 @@
         <w:pStyle w:val="Heading1"/>
       </w:pPr>
       <w:r>
-        <w:t>Data Cleaning:</w:t>
+        <w:t>1. Introduction</w:t>
       </w:r>
     </w:p>
     <w:p>
@@ -190,16 +79,122 @@
         <w:pStyle w:val="Heading2"/>
       </w:pPr>
       <w:r>
-        <w:t>1. Check for missing values</w:t>
+        <w:t>Problem Statement</w:t>
+      </w:r>
+    </w:p>
+    <w:p>
+      <w:r>
+        <w:t>This project predicts the approved dollar amount for small business loans using the SBA National Loan Dataset. The target variable is GrAppv, the gross amount approved by the lender. The project is a regression task, not a default-risk classification task.</w:t>
       </w:r>
     </w:p>
     <w:p>
       <w:pPr>
-        <w:spacing w:after="160"/>
-        <w:jc w:val="both"/>
+        <w:pStyle w:val="Heading2"/>
       </w:pPr>
       <w:r>
-        <w:t>The first step was to inspect missing values in the SBA columns. Some fields have only small gaps, while charge-off related fields have many missing values because not every loan charged off. For this project, post-loan performance columns were removed from the model because they would leak future information into the approval amount prediction.</w:t>
+        <w:t>Motivation and Goals</w:t>
+      </w:r>
+    </w:p>
+    <w:p>
+      <w:r>
+        <w:t>Small business lending decisions depend on many signals, including loan term, business size, state, lender location, industry, program flags, and whether the business is new or existing. A model that estimates an expected approved amount can help borrowers set realistic expectations and can help lenders identify applications that may need closer review.</w:t>
+      </w:r>
+    </w:p>
+    <w:p>
+      <w:r>
+        <w:t>The main goal is to build a clean, reproducible machine learning workflow that predicts approved SBA loan amount and compares several regression models using consistent evaluation metrics.</w:t>
+      </w:r>
+    </w:p>
+    <w:p>
+      <w:pPr>
+        <w:pStyle w:val="Heading1"/>
+      </w:pPr>
+      <w:r>
+        <w:t>2. Background</w:t>
+      </w:r>
+    </w:p>
+    <w:p>
+      <w:r>
+        <w:t>The SBA 7(a)-style lending data is useful for predictive analytics because it contains historical lending records across many banks, states, industries, and years. Approved amount is highly skewed: many loans are small or medium sized, while a smaller number of very large loans pull the mean upward. This makes the task harder than a simple linear prediction problem.</w:t>
+      </w:r>
+    </w:p>
+    <w:p>
+      <w:r>
+        <w:t>The project uses supervised regression. Linear models provide simple baselines, while tree-based ensemble models can learn nonlinear relationships and interactions between features. Boosted tree models such as LightGBM, XGBoost, HistGradientBoosting, and CatBoost are especially useful for tabular data because they handle nonlinear patterns well.</w:t>
+      </w:r>
+    </w:p>
+    <w:p>
+      <w:pPr>
+        <w:pStyle w:val="Heading1"/>
+      </w:pPr>
+      <w:r>
+        <w:t>3. Methodology</w:t>
+      </w:r>
+    </w:p>
+    <w:p>
+      <w:pPr>
+        <w:pStyle w:val="Heading2"/>
+      </w:pPr>
+      <w:r>
+        <w:t>Tools and Libraries</w:t>
+      </w:r>
+    </w:p>
+    <w:p>
+      <w:pPr>
+        <w:pStyle w:val="ListBullet"/>
+      </w:pPr>
+      <w:r>
+        <w:t>Python, Jupyter Notebook, pandas, NumPy, SciPy</w:t>
+      </w:r>
+    </w:p>
+    <w:p>
+      <w:pPr>
+        <w:pStyle w:val="ListBullet"/>
+      </w:pPr>
+      <w:r>
+        <w:t>scikit-learn for preprocessing, splitting, linear models, Random Forest, Gradient Boosting, PCA, and metrics</w:t>
+      </w:r>
+    </w:p>
+    <w:p>
+      <w:pPr>
+        <w:pStyle w:val="ListBullet"/>
+      </w:pPr>
+      <w:r>
+        <w:t>LightGBM, XGBoost, and CatBoost for boosted tree regression</w:t>
+      </w:r>
+    </w:p>
+    <w:p>
+      <w:pPr>
+        <w:pStyle w:val="ListBullet"/>
+      </w:pPr>
+      <w:r>
+        <w:t>TensorFlow/Keras for the neural network model, with GPU support enabled in the project environment</w:t>
+      </w:r>
+    </w:p>
+    <w:p>
+      <w:pPr>
+        <w:pStyle w:val="ListBullet"/>
+      </w:pPr>
+      <w:r>
+        <w:t>Matplotlib and Seaborn for exploratory analysis and model diagnostics</w:t>
+      </w:r>
+    </w:p>
+    <w:p>
+      <w:pPr>
+        <w:pStyle w:val="Heading2"/>
+      </w:pPr>
+      <w:r>
+        <w:t>Dataset and Project Scope</w:t>
+      </w:r>
+    </w:p>
+    <w:p>
+      <w:r>
+        <w:t>The raw SBA file contains 899,164 rows and 27 columns before setting the loan number as the index. After target cleanup, 899,164 usable rows remain because the target field is present and positive for the records used here.</w:t>
+      </w:r>
+    </w:p>
+    <w:p>
+      <w:r>
+        <w:t>The model intentionally excludes post-approval performance fields and direct leakage fields such as SBA_Appv, DisbursementGross, MIS_Status, ChgOffPrinGr, and charge-off dates. This keeps the project focused on predicting the approved amount from information that would be more reasonable to know near approval time.</w:t>
       </w:r>
     </w:p>
     <w:p>
@@ -209,7 +204,7 @@
       <w:r>
         <w:drawing>
           <wp:inline xmlns:a="http://schemas.openxmlformats.org/drawingml/2006/main" xmlns:pic="http://schemas.openxmlformats.org/drawingml/2006/picture">
-            <wp:extent cx="5303520" cy="2979457"/>
+            <wp:extent cx="5669280" cy="3184937"/>
             <wp:docPr id="1" name="Picture 1"/>
             <wp:cNvGraphicFramePr>
               <a:graphicFrameLocks noChangeAspect="1"/>
@@ -222,7 +217,7 @@
                     <pic:cNvPicPr/>
                   </pic:nvPicPr>
                   <pic:blipFill>
-                    <a:blip r:embed="rId10"/>
+                    <a:blip r:embed="rId9"/>
                     <a:stretch>
                       <a:fillRect/>
                     </a:stretch>
@@ -230,7 +225,7 @@
                   <pic:spPr>
                     <a:xfrm>
                       <a:off x="0" y="0"/>
-                      <a:ext cx="5303520" cy="2979457"/>
+                      <a:ext cx="5669280" cy="3184937"/>
                     </a:xfrm>
                     <a:prstGeom prst="rect"/>
                   </pic:spPr>
@@ -243,15 +238,14 @@
     </w:p>
     <w:p>
       <w:pPr>
-        <w:spacing w:after="240"/>
         <w:jc w:val="center"/>
       </w:pPr>
       <w:r>
         <w:rPr>
-          <w:rFonts w:ascii="Times New Roman" w:hAnsi="Times New Roman"/>
-          <w:sz w:val="20"/>
+          <w:i/>
+          <w:sz w:val="18"/>
         </w:rPr>
-        <w:t>Figure 1: Percentage of missing values in the raw SBA dataset.</w:t>
+        <w:t>Figure 1. Missing-value profile of the SBA dataset.</w:t>
       </w:r>
     </w:p>
     <w:p>
@@ -259,106 +253,76 @@
         <w:pStyle w:val="Heading2"/>
       </w:pPr>
       <w:r>
-        <w:t>2. Clean currency and date fields</w:t>
+        <w:t>Preprocessing and Feature Engineering</w:t>
       </w:r>
     </w:p>
     <w:p>
       <w:pPr>
-        <w:spacing w:after="160"/>
-        <w:jc w:val="both"/>
+        <w:pStyle w:val="ListNumber"/>
       </w:pPr>
       <w:r>
-        <w:t>The money columns were stored as currency strings, so symbols, commas, and whitespace were removed before converting them to numeric values. The target GrAppv was checked for missing and non-positive values because regression on approved dollar amount requires a valid positive target. Approval and disbursement dates were parsed so that year and month features could be derived.</w:t>
+        <w:t>Cleaned currency columns by removing dollar signs, commas, and whitespace before converting them to numeric values.</w:t>
       </w:r>
     </w:p>
     <w:p>
       <w:pPr>
-        <w:pStyle w:val="Heading2"/>
+        <w:pStyle w:val="ListNumber"/>
       </w:pPr>
       <w:r>
-        <w:t>3. Treat missing values without replacing everything by zero</w:t>
+        <w:t>Converted date fields into datetime values and created approval year, month, quarter, and decade features.</w:t>
       </w:r>
     </w:p>
     <w:p>
       <w:pPr>
-        <w:spacing w:after="160"/>
-        <w:jc w:val="both"/>
+        <w:pStyle w:val="ListNumber"/>
       </w:pPr>
       <w:r>
-        <w:t>The preprocessing does not fill all missing values with zero. Numeric features are filled with their median values, while categorical features are filled with Unknown. This keeps missing categories separate from real numeric zeros. Later, one-hot encoding creates many 0 and 1 columns. Those zeros are normal dummy-variable indicators and do not mean that all missing values were changed to zero.</w:t>
+        <w:t>Created term features such as term_years, is_long_term, and is_very_long_term.</w:t>
       </w:r>
     </w:p>
     <w:p>
       <w:pPr>
-        <w:pStyle w:val="Heading2"/>
+        <w:pStyle w:val="ListNumber"/>
       </w:pPr>
       <w:r>
-        <w:t>4. Engineer SBA-specific features</w:t>
+        <w:t>Created employment features such as total_jobs_supported, job_creation_ratio, and retained_job_ratio.</w:t>
       </w:r>
     </w:p>
     <w:p>
       <w:pPr>
-        <w:pStyle w:val="ListBullet"/>
+        <w:pStyle w:val="ListNumber"/>
       </w:pPr>
       <w:r>
-        <w:t>NAICS was converted into NAICS_sector using the first two digits of the industry code.</w:t>
+        <w:t>Converted NAICS into broad sector and capped 3-digit industry group features.</w:t>
       </w:r>
     </w:p>
     <w:p>
       <w:pPr>
-        <w:pStyle w:val="ListBullet"/>
+        <w:pStyle w:val="ListNumber"/>
       </w:pPr>
       <w:r>
-        <w:t>FranchiseCode was simplified into an is_franchise indicator.</w:t>
+        <w:t>Created geographic and lender features such as Zip3, same_state_bank, city frequency, zip frequency, bank frequency, top city group, and top bank group.</w:t>
       </w:r>
     </w:p>
     <w:p>
       <w:pPr>
-        <w:pStyle w:val="ListBullet"/>
+        <w:pStyle w:val="ListNumber"/>
       </w:pPr>
       <w:r>
-        <w:t>RevLineCr, LowDoc, NewExist, and UrbanRural were normalized into readable categories.</w:t>
+        <w:t>Filled numeric missing values with medians and categorical missing values with Unknown instead of replacing everything with zero.</w:t>
       </w:r>
     </w:p>
     <w:p>
       <w:pPr>
-        <w:pStyle w:val="ListBullet"/>
+        <w:pStyle w:val="ListNumber"/>
       </w:pPr>
       <w:r>
-        <w:t>City, Zip, and Bank were converted to frequency features to avoid very wide high-cardinality encoding.</w:t>
+        <w:t>One-hot encoded categorical features using compact int8 dummy columns and sanitized feature names for model compatibility.</w:t>
       </w:r>
     </w:p>
     <w:p>
-      <w:pPr>
-        <w:pStyle w:val="ListBullet"/>
-      </w:pPr>
       <w:r>
-        <w:t>Approval date was converted into approval_year and approval_month.</w:t>
-      </w:r>
-    </w:p>
-    <w:p>
-      <w:pPr>
-        <w:pStyle w:val="Heading1"/>
-      </w:pPr>
-      <w:r>
-        <w:t>Exploratory Data Analysis:</w:t>
-      </w:r>
-    </w:p>
-    <w:p>
-      <w:pPr>
-        <w:pStyle w:val="Heading2"/>
-      </w:pPr>
-      <w:r>
-        <w:t>1. Univariate analysis</w:t>
-      </w:r>
-    </w:p>
-    <w:p>
-      <w:pPr>
-        <w:spacing w:after="160"/>
-        <w:jc w:val="both"/>
-      </w:pPr>
-      <w:r>
-        <w:t>The approved amount is highly skewed. The median approved amount is $90,000, while the mean is $192,687, which shows that a smaller number of large loans pull the average upward. The median term is 84 months. The top state by loan count is CA, and the most common NAICS sector code is Unknown.</w:t>
+        <w:t>The final modeling table uses 19 numeric features and 14 categorical features before encoding. After one-hot encoding, the model input contains 381 features.</w:t>
       </w:r>
     </w:p>
     <w:p>
@@ -368,7 +332,7 @@
       <w:r>
         <w:drawing>
           <wp:inline xmlns:a="http://schemas.openxmlformats.org/drawingml/2006/main" xmlns:pic="http://schemas.openxmlformats.org/drawingml/2006/picture">
-            <wp:extent cx="5303520" cy="2974620"/>
+            <wp:extent cx="5669280" cy="3179767"/>
             <wp:docPr id="2" name="Picture 2"/>
             <wp:cNvGraphicFramePr>
               <a:graphicFrameLocks noChangeAspect="1"/>
@@ -381,7 +345,7 @@
                     <pic:cNvPicPr/>
                   </pic:nvPicPr>
                   <pic:blipFill>
-                    <a:blip r:embed="rId11"/>
+                    <a:blip r:embed="rId10"/>
                     <a:stretch>
                       <a:fillRect/>
                     </a:stretch>
@@ -389,7 +353,7 @@
                   <pic:spPr>
                     <a:xfrm>
                       <a:off x="0" y="0"/>
-                      <a:ext cx="5303520" cy="2974620"/>
+                      <a:ext cx="5669280" cy="3179767"/>
                     </a:xfrm>
                     <a:prstGeom prst="rect"/>
                   </pic:spPr>
@@ -402,15 +366,14 @@
     </w:p>
     <w:p>
       <w:pPr>
-        <w:spacing w:after="240"/>
         <w:jc w:val="center"/>
       </w:pPr>
       <w:r>
         <w:rPr>
-          <w:rFonts w:ascii="Times New Roman" w:hAnsi="Times New Roman"/>
-          <w:sz w:val="20"/>
+          <w:i/>
+          <w:sz w:val="18"/>
         </w:rPr>
-        <w:t>Figure 2: Distribution of the approved SBA loan amount after currency cleanup.</w:t>
+        <w:t>Figure 2. Approved loan amount distribution.</w:t>
       </w:r>
     </w:p>
     <w:p>
@@ -420,7 +383,7 @@
       <w:r>
         <w:drawing>
           <wp:inline xmlns:a="http://schemas.openxmlformats.org/drawingml/2006/main" xmlns:pic="http://schemas.openxmlformats.org/drawingml/2006/picture">
-            <wp:extent cx="5303520" cy="2746091"/>
+            <wp:extent cx="5669280" cy="3179767"/>
             <wp:docPr id="3" name="Picture 3"/>
             <wp:cNvGraphicFramePr>
               <a:graphicFrameLocks noChangeAspect="1"/>
@@ -429,11 +392,11 @@
               <a:graphicData uri="http://schemas.openxmlformats.org/drawingml/2006/picture">
                 <pic:pic>
                   <pic:nvPicPr>
-                    <pic:cNvPr id="0" name="category_counts.png"/>
+                    <pic:cNvPr id="0" name="term_vs_amount.png"/>
                     <pic:cNvPicPr/>
                   </pic:nvPicPr>
                   <pic:blipFill>
-                    <a:blip r:embed="rId12"/>
+                    <a:blip r:embed="rId11"/>
                     <a:stretch>
                       <a:fillRect/>
                     </a:stretch>
@@ -441,7 +404,7 @@
                   <pic:spPr>
                     <a:xfrm>
                       <a:off x="0" y="0"/>
-                      <a:ext cx="5303520" cy="2746091"/>
+                      <a:ext cx="5669280" cy="3179767"/>
                     </a:xfrm>
                     <a:prstGeom prst="rect"/>
                   </pic:spPr>
@@ -454,15 +417,14 @@
     </w:p>
     <w:p>
       <w:pPr>
-        <w:spacing w:after="240"/>
         <w:jc w:val="center"/>
       </w:pPr>
       <w:r>
         <w:rPr>
-          <w:rFonts w:ascii="Times New Roman" w:hAnsi="Times New Roman"/>
-          <w:sz w:val="20"/>
+          <w:i/>
+          <w:sz w:val="18"/>
         </w:rPr>
-        <w:t>Figure 3: Loan counts by common states and industry sectors.</w:t>
+        <w:t>Figure 3. Loan term versus approved amount on a log dollar scale.</w:t>
       </w:r>
     </w:p>
     <w:p>
@@ -470,125 +432,44 @@
         <w:pStyle w:val="Heading2"/>
       </w:pPr>
       <w:r>
-        <w:t>2. Multivariate analysis</w:t>
+        <w:t>Training and Evaluation Design</w:t>
+      </w:r>
+    </w:p>
+    <w:p>
+      <w:r>
+        <w:t>The dataset was split into 575,464 training rows, 143,867 validation rows, and 179,833 test rows. Models are compared on the same test set using MAE, RMSE, R2, and RMSLE.</w:t>
       </w:r>
     </w:p>
     <w:p>
       <w:pPr>
-        <w:spacing w:after="160"/>
-        <w:jc w:val="both"/>
+        <w:pStyle w:val="ListBullet"/>
       </w:pPr>
       <w:r>
-        <w:t>The correlation analysis shows that the target is more connected to loan term and business size fields than to job creation fields alone. The scatter plot also shows that longer loan terms often appear with larger approved amounts, but the relationship is noisy, so nonlinear models are helpful.</w:t>
+        <w:t>MAE shows the average dollar error and is easy to interpret.</w:t>
       </w:r>
     </w:p>
     <w:p>
       <w:pPr>
-        <w:jc w:val="center"/>
+        <w:pStyle w:val="ListBullet"/>
       </w:pPr>
       <w:r>
-        <w:drawing>
-          <wp:inline xmlns:a="http://schemas.openxmlformats.org/drawingml/2006/main" xmlns:pic="http://schemas.openxmlformats.org/drawingml/2006/picture">
-            <wp:extent cx="5303520" cy="4600227"/>
-            <wp:docPr id="4" name="Picture 4"/>
-            <wp:cNvGraphicFramePr>
-              <a:graphicFrameLocks noChangeAspect="1"/>
-            </wp:cNvGraphicFramePr>
-            <a:graphic>
-              <a:graphicData uri="http://schemas.openxmlformats.org/drawingml/2006/picture">
-                <pic:pic>
-                  <pic:nvPicPr>
-                    <pic:cNvPr id="0" name="numeric_correlation.png"/>
-                    <pic:cNvPicPr/>
-                  </pic:nvPicPr>
-                  <pic:blipFill>
-                    <a:blip r:embed="rId13"/>
-                    <a:stretch>
-                      <a:fillRect/>
-                    </a:stretch>
-                  </pic:blipFill>
-                  <pic:spPr>
-                    <a:xfrm>
-                      <a:off x="0" y="0"/>
-                      <a:ext cx="5303520" cy="4600227"/>
-                    </a:xfrm>
-                    <a:prstGeom prst="rect"/>
-                  </pic:spPr>
-                </pic:pic>
-              </a:graphicData>
-            </a:graphic>
-          </wp:inline>
-        </w:drawing>
+        <w:t>RMSE penalizes large mistakes more strongly, which matters for very large loans.</w:t>
       </w:r>
     </w:p>
     <w:p>
       <w:pPr>
-        <w:spacing w:after="240"/>
-        <w:jc w:val="center"/>
+        <w:pStyle w:val="ListBullet"/>
       </w:pPr>
       <w:r>
-        <w:rPr>
-          <w:rFonts w:ascii="Times New Roman" w:hAnsi="Times New Roman"/>
-          <w:sz w:val="20"/>
-        </w:rPr>
-        <w:t>Figure 4: Correlation heatmap for key numeric SBA fields.</w:t>
+        <w:t>R2 measures explained variance relative to a simple mean-based prediction.</w:t>
       </w:r>
     </w:p>
     <w:p>
       <w:pPr>
-        <w:jc w:val="center"/>
+        <w:pStyle w:val="ListBullet"/>
       </w:pPr>
       <w:r>
-        <w:drawing>
-          <wp:inline xmlns:a="http://schemas.openxmlformats.org/drawingml/2006/main" xmlns:pic="http://schemas.openxmlformats.org/drawingml/2006/picture">
-            <wp:extent cx="5303520" cy="2974620"/>
-            <wp:docPr id="5" name="Picture 5"/>
-            <wp:cNvGraphicFramePr>
-              <a:graphicFrameLocks noChangeAspect="1"/>
-            </wp:cNvGraphicFramePr>
-            <a:graphic>
-              <a:graphicData uri="http://schemas.openxmlformats.org/drawingml/2006/picture">
-                <pic:pic>
-                  <pic:nvPicPr>
-                    <pic:cNvPr id="0" name="term_vs_amount.png"/>
-                    <pic:cNvPicPr/>
-                  </pic:nvPicPr>
-                  <pic:blipFill>
-                    <a:blip r:embed="rId14"/>
-                    <a:stretch>
-                      <a:fillRect/>
-                    </a:stretch>
-                  </pic:blipFill>
-                  <pic:spPr>
-                    <a:xfrm>
-                      <a:off x="0" y="0"/>
-                      <a:ext cx="5303520" cy="2974620"/>
-                    </a:xfrm>
-                    <a:prstGeom prst="rect"/>
-                  </pic:spPr>
-                </pic:pic>
-              </a:graphicData>
-            </a:graphic>
-          </wp:inline>
-        </w:drawing>
-      </w:r>
-    </w:p>
-    <w:p>
-      <w:pPr>
-        <w:spacing w:after="240"/>
-        <w:jc w:val="center"/>
-      </w:pPr>
-      <w:r>
-        <w:rPr>
-          <w:rFonts w:ascii="Times New Roman" w:hAnsi="Times New Roman"/>
-          <w:sz w:val="20"/>
-        </w:rPr>
-        <w:t>Figure 5: Relationship between loan term and approved amount on a log dollar scale.</w:t>
-      </w:r>
-    </w:p>
-    <w:p>
-      <w:r>
-        <w:br w:type="page"/>
+        <w:t>RMSLE measures relative error and is useful when loan amounts span several orders of magnitude.</w:t>
       </w:r>
     </w:p>
     <w:p>
@@ -596,89 +477,22 @@
         <w:pStyle w:val="Heading1"/>
       </w:pPr>
       <w:r>
-        <w:t>Feature Selection and Encoding:</w:t>
+        <w:t>4. Implementation</w:t>
       </w:r>
     </w:p>
     <w:p>
-      <w:pPr>
-        <w:spacing w:after="160"/>
-        <w:jc w:val="both"/>
-      </w:pPr>
       <w:r>
-        <w:t>The original property-loan columns were replaced with SBA-specific features. Identifier, name, post-approval performance, and direct leakage columns were removed. The model uses loan term, employment fields, approval year and month, business geography, industry sector, program flags, and frequency-encoded city, ZIP, and bank fields.</w:t>
+        <w:t>The implementation is contained in src/LendWise.ipynb. The notebook downloads the SBA dataset when missing, cleans the raw data, performs exploratory analysis, builds the modeling table, trains the models, and generates evaluation plots.</w:t>
       </w:r>
     </w:p>
     <w:p>
-      <w:pPr>
-        <w:spacing w:after="160"/>
-        <w:jc w:val="both"/>
-      </w:pPr>
       <w:r>
-        <w:t>After encoding, the modeling file contains 158 input features plus the target column. Categorical values were one-hot encoded so linear and tree models could consume them consistently. Numeric features were scaled for models that benefit from scaling.</w:t>
+        <w:t>The final model list is: Linear Regression, Ridge Regression, PCA + Linear Regression, Gradient Boosting, Random Forest, HistGradientBoosting, LightGBM, XGBoost, CatBoost, and Neural Network.</w:t>
       </w:r>
     </w:p>
     <w:p>
-      <w:pPr>
-        <w:pStyle w:val="Heading2"/>
-      </w:pPr>
       <w:r>
-        <w:t>Selected numeric features</w:t>
-      </w:r>
-    </w:p>
-    <w:p>
-      <w:pPr>
-        <w:pStyle w:val="ListBullet"/>
-      </w:pPr>
-      <w:r>
-        <w:t>Term, NoEmp, CreateJob, RetainedJob</w:t>
-      </w:r>
-    </w:p>
-    <w:p>
-      <w:pPr>
-        <w:pStyle w:val="ListBullet"/>
-      </w:pPr>
-      <w:r>
-        <w:t>ApprovalFY, approval_year, approval_month</w:t>
-      </w:r>
-    </w:p>
-    <w:p>
-      <w:pPr>
-        <w:pStyle w:val="ListBullet"/>
-      </w:pPr>
-      <w:r>
-        <w:t>City_freq, Zip_freq, Bank_freq</w:t>
-      </w:r>
-    </w:p>
-    <w:p>
-      <w:pPr>
-        <w:pStyle w:val="Heading2"/>
-      </w:pPr>
-      <w:r>
-        <w:t>Selected categorical features</w:t>
-      </w:r>
-    </w:p>
-    <w:p>
-      <w:pPr>
-        <w:pStyle w:val="ListBullet"/>
-      </w:pPr>
-      <w:r>
-        <w:t>State and BankState</w:t>
-      </w:r>
-    </w:p>
-    <w:p>
-      <w:pPr>
-        <w:pStyle w:val="ListBullet"/>
-      </w:pPr>
-      <w:r>
-        <w:t>NewExist, UrbanRural, RevLineCr, LowDoc</w:t>
-      </w:r>
-    </w:p>
-    <w:p>
-      <w:pPr>
-        <w:pStyle w:val="ListBullet"/>
-      </w:pPr>
-      <w:r>
-        <w:t>NAICS_sector and is_franchise</w:t>
+        <w:t>The neural network cell now checks for TensorFlow GPU availability and enables memory growth when a GPU is found. In the final run, TensorFlow detected the NVIDIA GeForce RTX 4060 Laptop GPU.</w:t>
       </w:r>
     </w:p>
     <w:p>
@@ -686,73 +500,12 @@
         <w:pStyle w:val="Heading1"/>
       </w:pPr>
       <w:r>
-        <w:t>Model Implementation:</w:t>
+        <w:t>5. Results and Evaluation</w:t>
       </w:r>
     </w:p>
     <w:p>
-      <w:pPr>
-        <w:spacing w:after="160"/>
-        <w:jc w:val="both"/>
-      </w:pPr>
       <w:r>
-        <w:t>The project keeps the original regression-model idea but updates the model set for a larger tabular lending dataset. Linear Regression, Random Forest, Gradient Boosting, PCA Regression, and Neural Network models were adapted first. Ridge Regression was added as a stronger linear baseline. HistGradientBoosting, LightGBM, XGBoost, and CatBoost were added because they generally perform well on structured tabular data.</w:t>
-      </w:r>
-    </w:p>
-    <w:p>
-      <w:pPr>
-        <w:pStyle w:val="ListBullet"/>
-      </w:pPr>
-      <w:r>
-        <w:t>Dummy Regressor gives a simple baseline for comparison.</w:t>
-      </w:r>
-    </w:p>
-    <w:p>
-      <w:pPr>
-        <w:pStyle w:val="ListBullet"/>
-      </w:pPr>
-      <w:r>
-        <w:t>Linear Regression and Ridge test whether a simple linear pattern is enough.</w:t>
-      </w:r>
-    </w:p>
-    <w:p>
-      <w:pPr>
-        <w:pStyle w:val="ListBullet"/>
-      </w:pPr>
-      <w:r>
-        <w:t>Random Forest and Gradient Boosting capture nonlinear relationships.</w:t>
-      </w:r>
-    </w:p>
-    <w:p>
-      <w:pPr>
-        <w:pStyle w:val="ListBullet"/>
-      </w:pPr>
-      <w:r>
-        <w:t>LightGBM, XGBoost, and CatBoost provide stronger boosted-tree models for tabular data.</w:t>
-      </w:r>
-    </w:p>
-    <w:p>
-      <w:pPr>
-        <w:pStyle w:val="ListBullet"/>
-      </w:pPr>
-      <w:r>
-        <w:t>The Neural Network is included as an additional nonlinear model, but tabular boosting models are expected to be more competitive here.</w:t>
-      </w:r>
-    </w:p>
-    <w:p>
-      <w:pPr>
-        <w:pStyle w:val="Heading1"/>
-      </w:pPr>
-      <w:r>
-        <w:t>Evaluation:</w:t>
-      </w:r>
-    </w:p>
-    <w:p>
-      <w:pPr>
-        <w:spacing w:after="160"/>
-        <w:jc w:val="both"/>
-      </w:pPr>
-      <w:r>
-        <w:t>All models are evaluated as regression models on the original dollar scale. MAE is easy to interpret because it shows the average dollar error. RMSE penalizes larger mistakes more strongly. R2 shows explained variance, and RMSLE is useful because approved loan amounts are highly skewed.</w:t>
+        <w:t>The best model is LightGBM, with RMSE $184,928, MAE $98,792, R2 0.572, and RMSLE 0.951. The top models are close to each other, which suggests that the strongest signal comes from the engineered SBA features and that boosted/tree-based methods are a good fit for this dataset.</w:t>
       </w:r>
     </w:p>
     <w:tbl>
@@ -760,30 +513,44 @@
         <w:tblStyle w:val="TableGrid"/>
         <w:tblW w:type="auto" w:w="0"/>
         <w:jc w:val="center"/>
-        <w:tblLayout w:type="autofit"/>
         <w:tblLook w:firstColumn="1" w:firstRow="1" w:lastColumn="0" w:lastRow="0" w:noHBand="0" w:noVBand="1" w:val="04A0"/>
       </w:tblPr>
       <w:tblGrid>
-        <w:gridCol w:w="1608"/>
-        <w:gridCol w:w="1608"/>
-        <w:gridCol w:w="1608"/>
-        <w:gridCol w:w="1608"/>
-        <w:gridCol w:w="1608"/>
-        <w:gridCol w:w="1608"/>
+        <w:gridCol w:w="1680"/>
+        <w:gridCol w:w="1680"/>
+        <w:gridCol w:w="1680"/>
+        <w:gridCol w:w="1680"/>
+        <w:gridCol w:w="1680"/>
+        <w:gridCol w:w="1680"/>
       </w:tblGrid>
       <w:tr>
         <w:tc>
           <w:tcPr>
-            <w:tcW w:type="dxa" w:w="1608"/>
+            <w:tcW w:type="dxa" w:w="1680"/>
             <w:vAlign w:val="center"/>
+            <w:shd w:fill="D9EAD3"/>
           </w:tcPr>
           <w:p>
-            <w:pPr>
-              <w:jc w:val="center"/>
-            </w:pPr>
+            <w:r/>
             <w:r>
               <w:rPr>
-                <w:rFonts w:ascii="Times New Roman" w:hAnsi="Times New Roman"/>
+                <w:b/>
+                <w:sz w:val="18"/>
+              </w:rPr>
+              <w:t>Rank</w:t>
+            </w:r>
+          </w:p>
+        </w:tc>
+        <w:tc>
+          <w:tcPr>
+            <w:tcW w:type="dxa" w:w="1680"/>
+            <w:vAlign w:val="center"/>
+            <w:shd w:fill="D9EAD3"/>
+          </w:tcPr>
+          <w:p>
+            <w:r/>
+            <w:r>
+              <w:rPr>
                 <w:b/>
                 <w:sz w:val="18"/>
               </w:rPr>
@@ -793,16 +560,14 @@
         </w:tc>
         <w:tc>
           <w:tcPr>
-            <w:tcW w:type="dxa" w:w="1608"/>
+            <w:tcW w:type="dxa" w:w="1680"/>
             <w:vAlign w:val="center"/>
+            <w:shd w:fill="D9EAD3"/>
           </w:tcPr>
           <w:p>
-            <w:pPr>
-              <w:jc w:val="center"/>
-            </w:pPr>
+            <w:r/>
             <w:r>
               <w:rPr>
-                <w:rFonts w:ascii="Times New Roman" w:hAnsi="Times New Roman"/>
                 <w:b/>
                 <w:sz w:val="18"/>
               </w:rPr>
@@ -812,16 +577,14 @@
         </w:tc>
         <w:tc>
           <w:tcPr>
-            <w:tcW w:type="dxa" w:w="1608"/>
+            <w:tcW w:type="dxa" w:w="1680"/>
             <w:vAlign w:val="center"/>
+            <w:shd w:fill="D9EAD3"/>
           </w:tcPr>
           <w:p>
-            <w:pPr>
-              <w:jc w:val="center"/>
-            </w:pPr>
+            <w:r/>
             <w:r>
               <w:rPr>
-                <w:rFonts w:ascii="Times New Roman" w:hAnsi="Times New Roman"/>
                 <w:b/>
                 <w:sz w:val="18"/>
               </w:rPr>
@@ -831,16 +594,14 @@
         </w:tc>
         <w:tc>
           <w:tcPr>
-            <w:tcW w:type="dxa" w:w="1608"/>
+            <w:tcW w:type="dxa" w:w="1680"/>
             <w:vAlign w:val="center"/>
+            <w:shd w:fill="D9EAD3"/>
           </w:tcPr>
           <w:p>
-            <w:pPr>
-              <w:jc w:val="center"/>
-            </w:pPr>
+            <w:r/>
             <w:r>
               <w:rPr>
-                <w:rFonts w:ascii="Times New Roman" w:hAnsi="Times New Roman"/>
                 <w:b/>
                 <w:sz w:val="18"/>
               </w:rPr>
@@ -850,16 +611,14 @@
         </w:tc>
         <w:tc>
           <w:tcPr>
-            <w:tcW w:type="dxa" w:w="1608"/>
+            <w:tcW w:type="dxa" w:w="1680"/>
             <w:vAlign w:val="center"/>
+            <w:shd w:fill="D9EAD3"/>
           </w:tcPr>
           <w:p>
-            <w:pPr>
-              <w:jc w:val="center"/>
-            </w:pPr>
+            <w:r/>
             <w:r>
               <w:rPr>
-                <w:rFonts w:ascii="Times New Roman" w:hAnsi="Times New Roman"/>
                 <w:b/>
                 <w:sz w:val="18"/>
               </w:rPr>
@@ -867,39 +626,34 @@
             </w:r>
           </w:p>
         </w:tc>
-        <w:tc>
-          <w:tcPr>
-            <w:tcW w:type="dxa" w:w="1608"/>
-            <w:vAlign w:val="center"/>
-          </w:tcPr>
-          <w:p>
-            <w:pPr>
-              <w:jc w:val="center"/>
-            </w:pPr>
-            <w:r>
-              <w:rPr>
-                <w:rFonts w:ascii="Times New Roman" w:hAnsi="Times New Roman"/>
-                <w:b/>
-                <w:sz w:val="18"/>
-              </w:rPr>
-              <w:t>Fit Sec.</w:t>
-            </w:r>
-          </w:p>
-        </w:tc>
       </w:tr>
       <w:tr>
         <w:tc>
           <w:tcPr>
-            <w:tcW w:type="dxa" w:w="1608"/>
+            <w:tcW w:type="dxa" w:w="1680"/>
             <w:vAlign w:val="center"/>
           </w:tcPr>
           <w:p>
-            <w:pPr>
-              <w:jc w:val="left"/>
-            </w:pPr>
+            <w:r/>
             <w:r>
               <w:rPr>
-                <w:rFonts w:ascii="Times New Roman" w:hAnsi="Times New Roman"/>
+                <w:b w:val="0"/>
+                <w:sz w:val="18"/>
+              </w:rPr>
+              <w:t>1</w:t>
+            </w:r>
+          </w:p>
+        </w:tc>
+        <w:tc>
+          <w:tcPr>
+            <w:tcW w:type="dxa" w:w="1680"/>
+            <w:vAlign w:val="center"/>
+          </w:tcPr>
+          <w:p>
+            <w:r/>
+            <w:r>
+              <w:rPr>
+                <w:b w:val="0"/>
                 <w:sz w:val="18"/>
               </w:rPr>
               <w:t>LightGBM</w:t>
@@ -908,91 +662,65 @@
         </w:tc>
         <w:tc>
           <w:tcPr>
-            <w:tcW w:type="dxa" w:w="1608"/>
+            <w:tcW w:type="dxa" w:w="1680"/>
             <w:vAlign w:val="center"/>
           </w:tcPr>
           <w:p>
-            <w:pPr>
-              <w:jc w:val="right"/>
-            </w:pPr>
+            <w:r/>
             <w:r>
               <w:rPr>
-                <w:rFonts w:ascii="Times New Roman" w:hAnsi="Times New Roman"/>
+                <w:b w:val="0"/>
                 <w:sz w:val="18"/>
               </w:rPr>
-              <w:t>$102,262</w:t>
+              <w:t>$98,792</w:t>
             </w:r>
           </w:p>
         </w:tc>
         <w:tc>
           <w:tcPr>
-            <w:tcW w:type="dxa" w:w="1608"/>
+            <w:tcW w:type="dxa" w:w="1680"/>
             <w:vAlign w:val="center"/>
           </w:tcPr>
           <w:p>
-            <w:pPr>
-              <w:jc w:val="right"/>
-            </w:pPr>
+            <w:r/>
             <w:r>
               <w:rPr>
-                <w:rFonts w:ascii="Times New Roman" w:hAnsi="Times New Roman"/>
+                <w:b w:val="0"/>
                 <w:sz w:val="18"/>
               </w:rPr>
-              <w:t>$190,979</w:t>
+              <w:t>$184,928</w:t>
             </w:r>
           </w:p>
         </w:tc>
         <w:tc>
           <w:tcPr>
-            <w:tcW w:type="dxa" w:w="1608"/>
+            <w:tcW w:type="dxa" w:w="1680"/>
             <w:vAlign w:val="center"/>
           </w:tcPr>
           <w:p>
-            <w:pPr>
-              <w:jc w:val="right"/>
-            </w:pPr>
+            <w:r/>
             <w:r>
               <w:rPr>
-                <w:rFonts w:ascii="Times New Roman" w:hAnsi="Times New Roman"/>
+                <w:b w:val="0"/>
                 <w:sz w:val="18"/>
               </w:rPr>
-              <w:t>0.544</w:t>
+              <w:t>0.572</w:t>
             </w:r>
           </w:p>
         </w:tc>
         <w:tc>
           <w:tcPr>
-            <w:tcW w:type="dxa" w:w="1608"/>
+            <w:tcW w:type="dxa" w:w="1680"/>
             <w:vAlign w:val="center"/>
           </w:tcPr>
           <w:p>
-            <w:pPr>
-              <w:jc w:val="right"/>
-            </w:pPr>
+            <w:r/>
             <w:r>
               <w:rPr>
-                <w:rFonts w:ascii="Times New Roman" w:hAnsi="Times New Roman"/>
+                <w:b w:val="0"/>
                 <w:sz w:val="18"/>
               </w:rPr>
-              <w:t>0.887</w:t>
-            </w:r>
-          </w:p>
-        </w:tc>
-        <w:tc>
-          <w:tcPr>
-            <w:tcW w:type="dxa" w:w="1608"/>
-            <w:vAlign w:val="center"/>
-          </w:tcPr>
-          <w:p>
-            <w:pPr>
-              <w:jc w:val="right"/>
-            </w:pPr>
-            <w:r>
-              <w:rPr>
-                <w:rFonts w:ascii="Times New Roman" w:hAnsi="Times New Roman"/>
-                <w:sz w:val="18"/>
-              </w:rPr>
-              <w:t>7.24</w:t>
+              <w:t>0.951</w:t>
             </w:r>
           </w:p>
         </w:tc>
@@ -1000,16 +728,30 @@
       <w:tr>
         <w:tc>
           <w:tcPr>
-            <w:tcW w:type="dxa" w:w="1608"/>
+            <w:tcW w:type="dxa" w:w="1680"/>
             <w:vAlign w:val="center"/>
           </w:tcPr>
           <w:p>
-            <w:pPr>
-              <w:jc w:val="left"/>
-            </w:pPr>
+            <w:r/>
             <w:r>
               <w:rPr>
-                <w:rFonts w:ascii="Times New Roman" w:hAnsi="Times New Roman"/>
+                <w:b w:val="0"/>
+                <w:sz w:val="18"/>
+              </w:rPr>
+              <w:t>2</w:t>
+            </w:r>
+          </w:p>
+        </w:tc>
+        <w:tc>
+          <w:tcPr>
+            <w:tcW w:type="dxa" w:w="1680"/>
+            <w:vAlign w:val="center"/>
+          </w:tcPr>
+          <w:p>
+            <w:r/>
+            <w:r>
+              <w:rPr>
+                <w:b w:val="0"/>
                 <w:sz w:val="18"/>
               </w:rPr>
               <w:t>XGBoost</w:t>
@@ -1018,91 +760,65 @@
         </w:tc>
         <w:tc>
           <w:tcPr>
-            <w:tcW w:type="dxa" w:w="1608"/>
+            <w:tcW w:type="dxa" w:w="1680"/>
             <w:vAlign w:val="center"/>
           </w:tcPr>
           <w:p>
-            <w:pPr>
-              <w:jc w:val="right"/>
-            </w:pPr>
+            <w:r/>
             <w:r>
               <w:rPr>
-                <w:rFonts w:ascii="Times New Roman" w:hAnsi="Times New Roman"/>
+                <w:b w:val="0"/>
                 <w:sz w:val="18"/>
               </w:rPr>
-              <w:t>$102,434</w:t>
+              <w:t>$99,469</w:t>
             </w:r>
           </w:p>
         </w:tc>
         <w:tc>
           <w:tcPr>
-            <w:tcW w:type="dxa" w:w="1608"/>
+            <w:tcW w:type="dxa" w:w="1680"/>
             <w:vAlign w:val="center"/>
           </w:tcPr>
           <w:p>
-            <w:pPr>
-              <w:jc w:val="right"/>
-            </w:pPr>
+            <w:r/>
             <w:r>
               <w:rPr>
-                <w:rFonts w:ascii="Times New Roman" w:hAnsi="Times New Roman"/>
+                <w:b w:val="0"/>
                 <w:sz w:val="18"/>
               </w:rPr>
-              <w:t>$191,836</w:t>
+              <w:t>$186,165</w:t>
             </w:r>
           </w:p>
         </w:tc>
         <w:tc>
           <w:tcPr>
-            <w:tcW w:type="dxa" w:w="1608"/>
+            <w:tcW w:type="dxa" w:w="1680"/>
             <w:vAlign w:val="center"/>
           </w:tcPr>
           <w:p>
-            <w:pPr>
-              <w:jc w:val="right"/>
-            </w:pPr>
+            <w:r/>
             <w:r>
               <w:rPr>
-                <w:rFonts w:ascii="Times New Roman" w:hAnsi="Times New Roman"/>
+                <w:b w:val="0"/>
                 <w:sz w:val="18"/>
               </w:rPr>
-              <w:t>0.540</w:t>
+              <w:t>0.566</w:t>
             </w:r>
           </w:p>
         </w:tc>
         <w:tc>
           <w:tcPr>
-            <w:tcW w:type="dxa" w:w="1608"/>
+            <w:tcW w:type="dxa" w:w="1680"/>
             <w:vAlign w:val="center"/>
           </w:tcPr>
           <w:p>
-            <w:pPr>
-              <w:jc w:val="right"/>
-            </w:pPr>
+            <w:r/>
             <w:r>
               <w:rPr>
-                <w:rFonts w:ascii="Times New Roman" w:hAnsi="Times New Roman"/>
+                <w:b w:val="0"/>
                 <w:sz w:val="18"/>
               </w:rPr>
-              <w:t>0.872</w:t>
-            </w:r>
-          </w:p>
-        </w:tc>
-        <w:tc>
-          <w:tcPr>
-            <w:tcW w:type="dxa" w:w="1608"/>
-            <w:vAlign w:val="center"/>
-          </w:tcPr>
-          <w:p>
-            <w:pPr>
-              <w:jc w:val="right"/>
-            </w:pPr>
-            <w:r>
-              <w:rPr>
-                <w:rFonts w:ascii="Times New Roman" w:hAnsi="Times New Roman"/>
-                <w:sz w:val="18"/>
-              </w:rPr>
-              <w:t>7.31</w:t>
+              <w:t>0.869</w:t>
             </w:r>
           </w:p>
         </w:tc>
@@ -1110,16 +826,30 @@
       <w:tr>
         <w:tc>
           <w:tcPr>
-            <w:tcW w:type="dxa" w:w="1608"/>
+            <w:tcW w:type="dxa" w:w="1680"/>
             <w:vAlign w:val="center"/>
           </w:tcPr>
           <w:p>
-            <w:pPr>
-              <w:jc w:val="left"/>
-            </w:pPr>
+            <w:r/>
             <w:r>
               <w:rPr>
-                <w:rFonts w:ascii="Times New Roman" w:hAnsi="Times New Roman"/>
+                <w:b w:val="0"/>
+                <w:sz w:val="18"/>
+              </w:rPr>
+              <w:t>3</w:t>
+            </w:r>
+          </w:p>
+        </w:tc>
+        <w:tc>
+          <w:tcPr>
+            <w:tcW w:type="dxa" w:w="1680"/>
+            <w:vAlign w:val="center"/>
+          </w:tcPr>
+          <w:p>
+            <w:r/>
+            <w:r>
+              <w:rPr>
+                <w:b w:val="0"/>
                 <w:sz w:val="18"/>
               </w:rPr>
               <w:t>HistGradientBoosting</w:t>
@@ -1128,91 +858,65 @@
         </w:tc>
         <w:tc>
           <w:tcPr>
-            <w:tcW w:type="dxa" w:w="1608"/>
+            <w:tcW w:type="dxa" w:w="1680"/>
             <w:vAlign w:val="center"/>
           </w:tcPr>
           <w:p>
-            <w:pPr>
-              <w:jc w:val="right"/>
-            </w:pPr>
+            <w:r/>
             <w:r>
               <w:rPr>
-                <w:rFonts w:ascii="Times New Roman" w:hAnsi="Times New Roman"/>
+                <w:b w:val="0"/>
                 <w:sz w:val="18"/>
               </w:rPr>
-              <w:t>$103,407</w:t>
+              <w:t>$99,842</w:t>
             </w:r>
           </w:p>
         </w:tc>
         <w:tc>
           <w:tcPr>
-            <w:tcW w:type="dxa" w:w="1608"/>
+            <w:tcW w:type="dxa" w:w="1680"/>
             <w:vAlign w:val="center"/>
           </w:tcPr>
           <w:p>
-            <w:pPr>
-              <w:jc w:val="right"/>
-            </w:pPr>
+            <w:r/>
             <w:r>
               <w:rPr>
-                <w:rFonts w:ascii="Times New Roman" w:hAnsi="Times New Roman"/>
+                <w:b w:val="0"/>
                 <w:sz w:val="18"/>
               </w:rPr>
-              <w:t>$192,361</w:t>
+              <w:t>$186,498</w:t>
             </w:r>
           </w:p>
         </w:tc>
         <w:tc>
           <w:tcPr>
-            <w:tcW w:type="dxa" w:w="1608"/>
+            <w:tcW w:type="dxa" w:w="1680"/>
             <w:vAlign w:val="center"/>
           </w:tcPr>
           <w:p>
-            <w:pPr>
-              <w:jc w:val="right"/>
-            </w:pPr>
+            <w:r/>
             <w:r>
               <w:rPr>
-                <w:rFonts w:ascii="Times New Roman" w:hAnsi="Times New Roman"/>
+                <w:b w:val="0"/>
                 <w:sz w:val="18"/>
               </w:rPr>
-              <w:t>0.537</w:t>
+              <w:t>0.565</w:t>
             </w:r>
           </w:p>
         </w:tc>
         <w:tc>
           <w:tcPr>
-            <w:tcW w:type="dxa" w:w="1608"/>
+            <w:tcW w:type="dxa" w:w="1680"/>
             <w:vAlign w:val="center"/>
           </w:tcPr>
           <w:p>
-            <w:pPr>
-              <w:jc w:val="right"/>
-            </w:pPr>
+            <w:r/>
             <w:r>
               <w:rPr>
-                <w:rFonts w:ascii="Times New Roman" w:hAnsi="Times New Roman"/>
+                <w:b w:val="0"/>
                 <w:sz w:val="18"/>
               </w:rPr>
-              <w:t>0.876</w:t>
-            </w:r>
-          </w:p>
-        </w:tc>
-        <w:tc>
-          <w:tcPr>
-            <w:tcW w:type="dxa" w:w="1608"/>
-            <w:vAlign w:val="center"/>
-          </w:tcPr>
-          <w:p>
-            <w:pPr>
-              <w:jc w:val="right"/>
-            </w:pPr>
-            <w:r>
-              <w:rPr>
-                <w:rFonts w:ascii="Times New Roman" w:hAnsi="Times New Roman"/>
-                <w:sz w:val="18"/>
-              </w:rPr>
-              <w:t>4.24</w:t>
+              <w:t>0.946</w:t>
             </w:r>
           </w:p>
         </w:tc>
@@ -1220,16 +924,30 @@
       <w:tr>
         <w:tc>
           <w:tcPr>
-            <w:tcW w:type="dxa" w:w="1608"/>
+            <w:tcW w:type="dxa" w:w="1680"/>
             <w:vAlign w:val="center"/>
           </w:tcPr>
           <w:p>
-            <w:pPr>
-              <w:jc w:val="left"/>
-            </w:pPr>
+            <w:r/>
             <w:r>
               <w:rPr>
-                <w:rFonts w:ascii="Times New Roman" w:hAnsi="Times New Roman"/>
+                <w:b w:val="0"/>
+                <w:sz w:val="18"/>
+              </w:rPr>
+              <w:t>4</w:t>
+            </w:r>
+          </w:p>
+        </w:tc>
+        <w:tc>
+          <w:tcPr>
+            <w:tcW w:type="dxa" w:w="1680"/>
+            <w:vAlign w:val="center"/>
+          </w:tcPr>
+          <w:p>
+            <w:r/>
+            <w:r>
+              <w:rPr>
+                <w:b w:val="0"/>
                 <w:sz w:val="18"/>
               </w:rPr>
               <w:t>Random Forest</w:t>
@@ -1238,91 +956,65 @@
         </w:tc>
         <w:tc>
           <w:tcPr>
-            <w:tcW w:type="dxa" w:w="1608"/>
+            <w:tcW w:type="dxa" w:w="1680"/>
             <w:vAlign w:val="center"/>
           </w:tcPr>
           <w:p>
-            <w:pPr>
-              <w:jc w:val="right"/>
-            </w:pPr>
+            <w:r/>
             <w:r>
               <w:rPr>
-                <w:rFonts w:ascii="Times New Roman" w:hAnsi="Times New Roman"/>
+                <w:b w:val="0"/>
                 <w:sz w:val="18"/>
               </w:rPr>
-              <w:t>$102,674</w:t>
+              <w:t>$98,301</w:t>
             </w:r>
           </w:p>
         </w:tc>
         <w:tc>
           <w:tcPr>
-            <w:tcW w:type="dxa" w:w="1608"/>
+            <w:tcW w:type="dxa" w:w="1680"/>
             <w:vAlign w:val="center"/>
           </w:tcPr>
           <w:p>
-            <w:pPr>
-              <w:jc w:val="right"/>
-            </w:pPr>
+            <w:r/>
             <w:r>
               <w:rPr>
-                <w:rFonts w:ascii="Times New Roman" w:hAnsi="Times New Roman"/>
+                <w:b w:val="0"/>
                 <w:sz w:val="18"/>
               </w:rPr>
-              <w:t>$195,008</w:t>
+              <w:t>$186,855</w:t>
             </w:r>
           </w:p>
         </w:tc>
         <w:tc>
           <w:tcPr>
-            <w:tcW w:type="dxa" w:w="1608"/>
+            <w:tcW w:type="dxa" w:w="1680"/>
             <w:vAlign w:val="center"/>
           </w:tcPr>
           <w:p>
-            <w:pPr>
-              <w:jc w:val="right"/>
-            </w:pPr>
+            <w:r/>
             <w:r>
               <w:rPr>
-                <w:rFonts w:ascii="Times New Roman" w:hAnsi="Times New Roman"/>
+                <w:b w:val="0"/>
                 <w:sz w:val="18"/>
               </w:rPr>
-              <w:t>0.524</w:t>
+              <w:t>0.563</w:t>
             </w:r>
           </w:p>
         </w:tc>
         <w:tc>
           <w:tcPr>
-            <w:tcW w:type="dxa" w:w="1608"/>
+            <w:tcW w:type="dxa" w:w="1680"/>
             <w:vAlign w:val="center"/>
           </w:tcPr>
           <w:p>
-            <w:pPr>
-              <w:jc w:val="right"/>
-            </w:pPr>
+            <w:r/>
             <w:r>
               <w:rPr>
-                <w:rFonts w:ascii="Times New Roman" w:hAnsi="Times New Roman"/>
+                <w:b w:val="0"/>
                 <w:sz w:val="18"/>
               </w:rPr>
-              <w:t>0.818</w:t>
-            </w:r>
-          </w:p>
-        </w:tc>
-        <w:tc>
-          <w:tcPr>
-            <w:tcW w:type="dxa" w:w="1608"/>
-            <w:vAlign w:val="center"/>
-          </w:tcPr>
-          <w:p>
-            <w:pPr>
-              <w:jc w:val="right"/>
-            </w:pPr>
-            <w:r>
-              <w:rPr>
-                <w:rFonts w:ascii="Times New Roman" w:hAnsi="Times New Roman"/>
-                <w:sz w:val="18"/>
-              </w:rPr>
-              <w:t>22.21</w:t>
+              <w:t>0.788</w:t>
             </w:r>
           </w:p>
         </w:tc>
@@ -1330,16 +1022,30 @@
       <w:tr>
         <w:tc>
           <w:tcPr>
-            <w:tcW w:type="dxa" w:w="1608"/>
+            <w:tcW w:type="dxa" w:w="1680"/>
             <w:vAlign w:val="center"/>
           </w:tcPr>
           <w:p>
-            <w:pPr>
-              <w:jc w:val="left"/>
-            </w:pPr>
+            <w:r/>
             <w:r>
               <w:rPr>
-                <w:rFonts w:ascii="Times New Roman" w:hAnsi="Times New Roman"/>
+                <w:b w:val="0"/>
+                <w:sz w:val="18"/>
+              </w:rPr>
+              <w:t>5</w:t>
+            </w:r>
+          </w:p>
+        </w:tc>
+        <w:tc>
+          <w:tcPr>
+            <w:tcW w:type="dxa" w:w="1680"/>
+            <w:vAlign w:val="center"/>
+          </w:tcPr>
+          <w:p>
+            <w:r/>
+            <w:r>
+              <w:rPr>
+                <w:b w:val="0"/>
                 <w:sz w:val="18"/>
               </w:rPr>
               <w:t>CatBoost</w:t>
@@ -1348,751 +1054,65 @@
         </w:tc>
         <w:tc>
           <w:tcPr>
-            <w:tcW w:type="dxa" w:w="1608"/>
+            <w:tcW w:type="dxa" w:w="1680"/>
             <w:vAlign w:val="center"/>
           </w:tcPr>
           <w:p>
-            <w:pPr>
-              <w:jc w:val="right"/>
-            </w:pPr>
+            <w:r/>
             <w:r>
               <w:rPr>
-                <w:rFonts w:ascii="Times New Roman" w:hAnsi="Times New Roman"/>
+                <w:b w:val="0"/>
                 <w:sz w:val="18"/>
               </w:rPr>
-              <w:t>$105,286</w:t>
+              <w:t>$102,672</w:t>
             </w:r>
           </w:p>
         </w:tc>
         <w:tc>
           <w:tcPr>
-            <w:tcW w:type="dxa" w:w="1608"/>
+            <w:tcW w:type="dxa" w:w="1680"/>
             <w:vAlign w:val="center"/>
           </w:tcPr>
           <w:p>
-            <w:pPr>
-              <w:jc w:val="right"/>
-            </w:pPr>
+            <w:r/>
             <w:r>
               <w:rPr>
-                <w:rFonts w:ascii="Times New Roman" w:hAnsi="Times New Roman"/>
+                <w:b w:val="0"/>
                 <w:sz w:val="18"/>
               </w:rPr>
-              <w:t>$195,335</w:t>
+              <w:t>$190,672</w:t>
             </w:r>
           </w:p>
         </w:tc>
         <w:tc>
           <w:tcPr>
-            <w:tcW w:type="dxa" w:w="1608"/>
+            <w:tcW w:type="dxa" w:w="1680"/>
             <w:vAlign w:val="center"/>
           </w:tcPr>
           <w:p>
-            <w:pPr>
-              <w:jc w:val="right"/>
-            </w:pPr>
+            <w:r/>
             <w:r>
               <w:rPr>
-                <w:rFonts w:ascii="Times New Roman" w:hAnsi="Times New Roman"/>
+                <w:b w:val="0"/>
                 <w:sz w:val="18"/>
               </w:rPr>
-              <w:t>0.523</w:t>
+              <w:t>0.545</w:t>
             </w:r>
           </w:p>
         </w:tc>
         <w:tc>
           <w:tcPr>
-            <w:tcW w:type="dxa" w:w="1608"/>
+            <w:tcW w:type="dxa" w:w="1680"/>
             <w:vAlign w:val="center"/>
           </w:tcPr>
           <w:p>
-            <w:pPr>
-              <w:jc w:val="right"/>
-            </w:pPr>
+            <w:r/>
             <w:r>
               <w:rPr>
-                <w:rFonts w:ascii="Times New Roman" w:hAnsi="Times New Roman"/>
+                <w:b w:val="0"/>
                 <w:sz w:val="18"/>
               </w:rPr>
-              <w:t>0.882</w:t>
-            </w:r>
-          </w:p>
-        </w:tc>
-        <w:tc>
-          <w:tcPr>
-            <w:tcW w:type="dxa" w:w="1608"/>
-            <w:vAlign w:val="center"/>
-          </w:tcPr>
-          <w:p>
-            <w:pPr>
-              <w:jc w:val="right"/>
-            </w:pPr>
-            <w:r>
-              <w:rPr>
-                <w:rFonts w:ascii="Times New Roman" w:hAnsi="Times New Roman"/>
-                <w:sz w:val="18"/>
-              </w:rPr>
-              <w:t>1.18</w:t>
-            </w:r>
-          </w:p>
-        </w:tc>
-      </w:tr>
-      <w:tr>
-        <w:tc>
-          <w:tcPr>
-            <w:tcW w:type="dxa" w:w="1608"/>
-            <w:vAlign w:val="center"/>
-          </w:tcPr>
-          <w:p>
-            <w:pPr>
-              <w:jc w:val="left"/>
-            </w:pPr>
-            <w:r>
-              <w:rPr>
-                <w:rFonts w:ascii="Times New Roman" w:hAnsi="Times New Roman"/>
-                <w:sz w:val="18"/>
-              </w:rPr>
-              <w:t>Gradient Boosting</w:t>
-            </w:r>
-          </w:p>
-        </w:tc>
-        <w:tc>
-          <w:tcPr>
-            <w:tcW w:type="dxa" w:w="1608"/>
-            <w:vAlign w:val="center"/>
-          </w:tcPr>
-          <w:p>
-            <w:pPr>
-              <w:jc w:val="right"/>
-            </w:pPr>
-            <w:r>
-              <w:rPr>
-                <w:rFonts w:ascii="Times New Roman" w:hAnsi="Times New Roman"/>
-                <w:sz w:val="18"/>
-              </w:rPr>
-              <w:t>$112,960</w:t>
-            </w:r>
-          </w:p>
-        </w:tc>
-        <w:tc>
-          <w:tcPr>
-            <w:tcW w:type="dxa" w:w="1608"/>
-            <w:vAlign w:val="center"/>
-          </w:tcPr>
-          <w:p>
-            <w:pPr>
-              <w:jc w:val="right"/>
-            </w:pPr>
-            <w:r>
-              <w:rPr>
-                <w:rFonts w:ascii="Times New Roman" w:hAnsi="Times New Roman"/>
-                <w:sz w:val="18"/>
-              </w:rPr>
-              <w:t>$206,178</w:t>
-            </w:r>
-          </w:p>
-        </w:tc>
-        <w:tc>
-          <w:tcPr>
-            <w:tcW w:type="dxa" w:w="1608"/>
-            <w:vAlign w:val="center"/>
-          </w:tcPr>
-          <w:p>
-            <w:pPr>
-              <w:jc w:val="right"/>
-            </w:pPr>
-            <w:r>
-              <w:rPr>
-                <w:rFonts w:ascii="Times New Roman" w:hAnsi="Times New Roman"/>
-                <w:sz w:val="18"/>
-              </w:rPr>
-              <w:t>0.468</w:t>
-            </w:r>
-          </w:p>
-        </w:tc>
-        <w:tc>
-          <w:tcPr>
-            <w:tcW w:type="dxa" w:w="1608"/>
-            <w:vAlign w:val="center"/>
-          </w:tcPr>
-          <w:p>
-            <w:pPr>
-              <w:jc w:val="right"/>
-            </w:pPr>
-            <w:r>
-              <w:rPr>
-                <w:rFonts w:ascii="Times New Roman" w:hAnsi="Times New Roman"/>
-                <w:sz w:val="18"/>
-              </w:rPr>
-              <w:t>0.961</w:t>
-            </w:r>
-          </w:p>
-        </w:tc>
-        <w:tc>
-          <w:tcPr>
-            <w:tcW w:type="dxa" w:w="1608"/>
-            <w:vAlign w:val="center"/>
-          </w:tcPr>
-          <w:p>
-            <w:pPr>
-              <w:jc w:val="right"/>
-            </w:pPr>
-            <w:r>
-              <w:rPr>
-                <w:rFonts w:ascii="Times New Roman" w:hAnsi="Times New Roman"/>
-                <w:sz w:val="18"/>
-              </w:rPr>
-              <w:t>21.44</w:t>
-            </w:r>
-          </w:p>
-        </w:tc>
-      </w:tr>
-      <w:tr>
-        <w:tc>
-          <w:tcPr>
-            <w:tcW w:type="dxa" w:w="1608"/>
-            <w:vAlign w:val="center"/>
-          </w:tcPr>
-          <w:p>
-            <w:pPr>
-              <w:jc w:val="left"/>
-            </w:pPr>
-            <w:r>
-              <w:rPr>
-                <w:rFonts w:ascii="Times New Roman" w:hAnsi="Times New Roman"/>
-                <w:sz w:val="18"/>
-              </w:rPr>
-              <w:t>Neural Network</w:t>
-            </w:r>
-          </w:p>
-        </w:tc>
-        <w:tc>
-          <w:tcPr>
-            <w:tcW w:type="dxa" w:w="1608"/>
-            <w:vAlign w:val="center"/>
-          </w:tcPr>
-          <w:p>
-            <w:pPr>
-              <w:jc w:val="right"/>
-            </w:pPr>
-            <w:r>
-              <w:rPr>
-                <w:rFonts w:ascii="Times New Roman" w:hAnsi="Times New Roman"/>
-                <w:sz w:val="18"/>
-              </w:rPr>
-              <w:t>$112,993</w:t>
-            </w:r>
-          </w:p>
-        </w:tc>
-        <w:tc>
-          <w:tcPr>
-            <w:tcW w:type="dxa" w:w="1608"/>
-            <w:vAlign w:val="center"/>
-          </w:tcPr>
-          <w:p>
-            <w:pPr>
-              <w:jc w:val="right"/>
-            </w:pPr>
-            <w:r>
-              <w:rPr>
-                <w:rFonts w:ascii="Times New Roman" w:hAnsi="Times New Roman"/>
-                <w:sz w:val="18"/>
-              </w:rPr>
-              <w:t>$212,052</w:t>
-            </w:r>
-          </w:p>
-        </w:tc>
-        <w:tc>
-          <w:tcPr>
-            <w:tcW w:type="dxa" w:w="1608"/>
-            <w:vAlign w:val="center"/>
-          </w:tcPr>
-          <w:p>
-            <w:pPr>
-              <w:jc w:val="right"/>
-            </w:pPr>
-            <w:r>
-              <w:rPr>
-                <w:rFonts w:ascii="Times New Roman" w:hAnsi="Times New Roman"/>
-                <w:sz w:val="18"/>
-              </w:rPr>
-              <w:t>0.437</w:t>
-            </w:r>
-          </w:p>
-        </w:tc>
-        <w:tc>
-          <w:tcPr>
-            <w:tcW w:type="dxa" w:w="1608"/>
-            <w:vAlign w:val="center"/>
-          </w:tcPr>
-          <w:p>
-            <w:pPr>
-              <w:jc w:val="right"/>
-            </w:pPr>
-            <w:r>
-              <w:rPr>
-                <w:rFonts w:ascii="Times New Roman" w:hAnsi="Times New Roman"/>
-                <w:sz w:val="18"/>
-              </w:rPr>
-              <w:t>2.134</w:t>
-            </w:r>
-          </w:p>
-        </w:tc>
-        <w:tc>
-          <w:tcPr>
-            <w:tcW w:type="dxa" w:w="1608"/>
-            <w:vAlign w:val="center"/>
-          </w:tcPr>
-          <w:p>
-            <w:pPr>
-              <w:jc w:val="right"/>
-            </w:pPr>
-            <w:r>
-              <w:rPr>
-                <w:rFonts w:ascii="Times New Roman" w:hAnsi="Times New Roman"/>
-                <w:sz w:val="18"/>
-              </w:rPr>
-              <w:t>7.30</w:t>
-            </w:r>
-          </w:p>
-        </w:tc>
-      </w:tr>
-      <w:tr>
-        <w:tc>
-          <w:tcPr>
-            <w:tcW w:type="dxa" w:w="1608"/>
-            <w:vAlign w:val="center"/>
-          </w:tcPr>
-          <w:p>
-            <w:pPr>
-              <w:jc w:val="left"/>
-            </w:pPr>
-            <w:r>
-              <w:rPr>
-                <w:rFonts w:ascii="Times New Roman" w:hAnsi="Times New Roman"/>
-                <w:sz w:val="18"/>
-              </w:rPr>
-              <w:t>Ridge Regression</w:t>
-            </w:r>
-          </w:p>
-        </w:tc>
-        <w:tc>
-          <w:tcPr>
-            <w:tcW w:type="dxa" w:w="1608"/>
-            <w:vAlign w:val="center"/>
-          </w:tcPr>
-          <w:p>
-            <w:pPr>
-              <w:jc w:val="right"/>
-            </w:pPr>
-            <w:r>
-              <w:rPr>
-                <w:rFonts w:ascii="Times New Roman" w:hAnsi="Times New Roman"/>
-                <w:sz w:val="18"/>
-              </w:rPr>
-              <w:t>$131,472</w:t>
-            </w:r>
-          </w:p>
-        </w:tc>
-        <w:tc>
-          <w:tcPr>
-            <w:tcW w:type="dxa" w:w="1608"/>
-            <w:vAlign w:val="center"/>
-          </w:tcPr>
-          <w:p>
-            <w:pPr>
-              <w:jc w:val="right"/>
-            </w:pPr>
-            <w:r>
-              <w:rPr>
-                <w:rFonts w:ascii="Times New Roman" w:hAnsi="Times New Roman"/>
-                <w:sz w:val="18"/>
-              </w:rPr>
-              <w:t>$221,236</w:t>
-            </w:r>
-          </w:p>
-        </w:tc>
-        <w:tc>
-          <w:tcPr>
-            <w:tcW w:type="dxa" w:w="1608"/>
-            <w:vAlign w:val="center"/>
-          </w:tcPr>
-          <w:p>
-            <w:pPr>
-              <w:jc w:val="right"/>
-            </w:pPr>
-            <w:r>
-              <w:rPr>
-                <w:rFonts w:ascii="Times New Roman" w:hAnsi="Times New Roman"/>
-                <w:sz w:val="18"/>
-              </w:rPr>
-              <w:t>0.388</w:t>
-            </w:r>
-          </w:p>
-        </w:tc>
-        <w:tc>
-          <w:tcPr>
-            <w:tcW w:type="dxa" w:w="1608"/>
-            <w:vAlign w:val="center"/>
-          </w:tcPr>
-          <w:p>
-            <w:pPr>
-              <w:jc w:val="right"/>
-            </w:pPr>
-            <w:r>
-              <w:rPr>
-                <w:rFonts w:ascii="Times New Roman" w:hAnsi="Times New Roman"/>
-                <w:sz w:val="18"/>
-              </w:rPr>
-              <w:t>3.537</w:t>
-            </w:r>
-          </w:p>
-        </w:tc>
-        <w:tc>
-          <w:tcPr>
-            <w:tcW w:type="dxa" w:w="1608"/>
-            <w:vAlign w:val="center"/>
-          </w:tcPr>
-          <w:p>
-            <w:pPr>
-              <w:jc w:val="right"/>
-            </w:pPr>
-            <w:r>
-              <w:rPr>
-                <w:rFonts w:ascii="Times New Roman" w:hAnsi="Times New Roman"/>
-                <w:sz w:val="18"/>
-              </w:rPr>
-              <w:t>0.81</w:t>
-            </w:r>
-          </w:p>
-        </w:tc>
-      </w:tr>
-      <w:tr>
-        <w:tc>
-          <w:tcPr>
-            <w:tcW w:type="dxa" w:w="1608"/>
-            <w:vAlign w:val="center"/>
-          </w:tcPr>
-          <w:p>
-            <w:pPr>
-              <w:jc w:val="left"/>
-            </w:pPr>
-            <w:r>
-              <w:rPr>
-                <w:rFonts w:ascii="Times New Roman" w:hAnsi="Times New Roman"/>
-                <w:sz w:val="18"/>
-              </w:rPr>
-              <w:t>Linear Regression</w:t>
-            </w:r>
-          </w:p>
-        </w:tc>
-        <w:tc>
-          <w:tcPr>
-            <w:tcW w:type="dxa" w:w="1608"/>
-            <w:vAlign w:val="center"/>
-          </w:tcPr>
-          <w:p>
-            <w:pPr>
-              <w:jc w:val="right"/>
-            </w:pPr>
-            <w:r>
-              <w:rPr>
-                <w:rFonts w:ascii="Times New Roman" w:hAnsi="Times New Roman"/>
-                <w:sz w:val="18"/>
-              </w:rPr>
-              <w:t>$131,473</w:t>
-            </w:r>
-          </w:p>
-        </w:tc>
-        <w:tc>
-          <w:tcPr>
-            <w:tcW w:type="dxa" w:w="1608"/>
-            <w:vAlign w:val="center"/>
-          </w:tcPr>
-          <w:p>
-            <w:pPr>
-              <w:jc w:val="right"/>
-            </w:pPr>
-            <w:r>
-              <w:rPr>
-                <w:rFonts w:ascii="Times New Roman" w:hAnsi="Times New Roman"/>
-                <w:sz w:val="18"/>
-              </w:rPr>
-              <w:t>$221,236</w:t>
-            </w:r>
-          </w:p>
-        </w:tc>
-        <w:tc>
-          <w:tcPr>
-            <w:tcW w:type="dxa" w:w="1608"/>
-            <w:vAlign w:val="center"/>
-          </w:tcPr>
-          <w:p>
-            <w:pPr>
-              <w:jc w:val="right"/>
-            </w:pPr>
-            <w:r>
-              <w:rPr>
-                <w:rFonts w:ascii="Times New Roman" w:hAnsi="Times New Roman"/>
-                <w:sz w:val="18"/>
-              </w:rPr>
-              <w:t>0.388</w:t>
-            </w:r>
-          </w:p>
-        </w:tc>
-        <w:tc>
-          <w:tcPr>
-            <w:tcW w:type="dxa" w:w="1608"/>
-            <w:vAlign w:val="center"/>
-          </w:tcPr>
-          <w:p>
-            <w:pPr>
-              <w:jc w:val="right"/>
-            </w:pPr>
-            <w:r>
-              <w:rPr>
-                <w:rFonts w:ascii="Times New Roman" w:hAnsi="Times New Roman"/>
-                <w:sz w:val="18"/>
-              </w:rPr>
-              <w:t>3.537</w:t>
-            </w:r>
-          </w:p>
-        </w:tc>
-        <w:tc>
-          <w:tcPr>
-            <w:tcW w:type="dxa" w:w="1608"/>
-            <w:vAlign w:val="center"/>
-          </w:tcPr>
-          <w:p>
-            <w:pPr>
-              <w:jc w:val="right"/>
-            </w:pPr>
-            <w:r>
-              <w:rPr>
-                <w:rFonts w:ascii="Times New Roman" w:hAnsi="Times New Roman"/>
-                <w:sz w:val="18"/>
-              </w:rPr>
-              <w:t>3.66</w:t>
-            </w:r>
-          </w:p>
-        </w:tc>
-      </w:tr>
-      <w:tr>
-        <w:tc>
-          <w:tcPr>
-            <w:tcW w:type="dxa" w:w="1608"/>
-            <w:vAlign w:val="center"/>
-          </w:tcPr>
-          <w:p>
-            <w:pPr>
-              <w:jc w:val="left"/>
-            </w:pPr>
-            <w:r>
-              <w:rPr>
-                <w:rFonts w:ascii="Times New Roman" w:hAnsi="Times New Roman"/>
-                <w:sz w:val="18"/>
-              </w:rPr>
-              <w:t>PCA + Linear Regression</w:t>
-            </w:r>
-          </w:p>
-        </w:tc>
-        <w:tc>
-          <w:tcPr>
-            <w:tcW w:type="dxa" w:w="1608"/>
-            <w:vAlign w:val="center"/>
-          </w:tcPr>
-          <w:p>
-            <w:pPr>
-              <w:jc w:val="right"/>
-            </w:pPr>
-            <w:r>
-              <w:rPr>
-                <w:rFonts w:ascii="Times New Roman" w:hAnsi="Times New Roman"/>
-                <w:sz w:val="18"/>
-              </w:rPr>
-              <w:t>$147,485</w:t>
-            </w:r>
-          </w:p>
-        </w:tc>
-        <w:tc>
-          <w:tcPr>
-            <w:tcW w:type="dxa" w:w="1608"/>
-            <w:vAlign w:val="center"/>
-          </w:tcPr>
-          <w:p>
-            <w:pPr>
-              <w:jc w:val="right"/>
-            </w:pPr>
-            <w:r>
-              <w:rPr>
-                <w:rFonts w:ascii="Times New Roman" w:hAnsi="Times New Roman"/>
-                <w:sz w:val="18"/>
-              </w:rPr>
-              <w:t>$244,161</w:t>
-            </w:r>
-          </w:p>
-        </w:tc>
-        <w:tc>
-          <w:tcPr>
-            <w:tcW w:type="dxa" w:w="1608"/>
-            <w:vAlign w:val="center"/>
-          </w:tcPr>
-          <w:p>
-            <w:pPr>
-              <w:jc w:val="right"/>
-            </w:pPr>
-            <w:r>
-              <w:rPr>
-                <w:rFonts w:ascii="Times New Roman" w:hAnsi="Times New Roman"/>
-                <w:sz w:val="18"/>
-              </w:rPr>
-              <w:t>0.254</w:t>
-            </w:r>
-          </w:p>
-        </w:tc>
-        <w:tc>
-          <w:tcPr>
-            <w:tcW w:type="dxa" w:w="1608"/>
-            <w:vAlign w:val="center"/>
-          </w:tcPr>
-          <w:p>
-            <w:pPr>
-              <w:jc w:val="right"/>
-            </w:pPr>
-            <w:r>
-              <w:rPr>
-                <w:rFonts w:ascii="Times New Roman" w:hAnsi="Times New Roman"/>
-                <w:sz w:val="18"/>
-              </w:rPr>
-              <w:t>3.283</w:t>
-            </w:r>
-          </w:p>
-        </w:tc>
-        <w:tc>
-          <w:tcPr>
-            <w:tcW w:type="dxa" w:w="1608"/>
-            <w:vAlign w:val="center"/>
-          </w:tcPr>
-          <w:p>
-            <w:pPr>
-              <w:jc w:val="right"/>
-            </w:pPr>
-            <w:r>
-              <w:rPr>
-                <w:rFonts w:ascii="Times New Roman" w:hAnsi="Times New Roman"/>
-                <w:sz w:val="18"/>
-              </w:rPr>
-              <w:t>15.81</w:t>
-            </w:r>
-          </w:p>
-        </w:tc>
-      </w:tr>
-      <w:tr>
-        <w:tc>
-          <w:tcPr>
-            <w:tcW w:type="dxa" w:w="1608"/>
-            <w:vAlign w:val="center"/>
-          </w:tcPr>
-          <w:p>
-            <w:pPr>
-              <w:jc w:val="left"/>
-            </w:pPr>
-            <w:r>
-              <w:rPr>
-                <w:rFonts w:ascii="Times New Roman" w:hAnsi="Times New Roman"/>
-                <w:sz w:val="18"/>
-              </w:rPr>
-              <w:t>Dummy Baseline</w:t>
-            </w:r>
-          </w:p>
-        </w:tc>
-        <w:tc>
-          <w:tcPr>
-            <w:tcW w:type="dxa" w:w="1608"/>
-            <w:vAlign w:val="center"/>
-          </w:tcPr>
-          <w:p>
-            <w:pPr>
-              <w:jc w:val="right"/>
-            </w:pPr>
-            <w:r>
-              <w:rPr>
-                <w:rFonts w:ascii="Times New Roman" w:hAnsi="Times New Roman"/>
-                <w:sz w:val="18"/>
-              </w:rPr>
-              <w:t>$154,582</w:t>
-            </w:r>
-          </w:p>
-        </w:tc>
-        <w:tc>
-          <w:tcPr>
-            <w:tcW w:type="dxa" w:w="1608"/>
-            <w:vAlign w:val="center"/>
-          </w:tcPr>
-          <w:p>
-            <w:pPr>
-              <w:jc w:val="right"/>
-            </w:pPr>
-            <w:r>
-              <w:rPr>
-                <w:rFonts w:ascii="Times New Roman" w:hAnsi="Times New Roman"/>
-                <w:sz w:val="18"/>
-              </w:rPr>
-              <w:t>$300,756</w:t>
-            </w:r>
-          </w:p>
-        </w:tc>
-        <w:tc>
-          <w:tcPr>
-            <w:tcW w:type="dxa" w:w="1608"/>
-            <w:vAlign w:val="center"/>
-          </w:tcPr>
-          <w:p>
-            <w:pPr>
-              <w:jc w:val="right"/>
-            </w:pPr>
-            <w:r>
-              <w:rPr>
-                <w:rFonts w:ascii="Times New Roman" w:hAnsi="Times New Roman"/>
-                <w:sz w:val="18"/>
-              </w:rPr>
-              <w:t>-0.132</w:t>
-            </w:r>
-          </w:p>
-        </w:tc>
-        <w:tc>
-          <w:tcPr>
-            <w:tcW w:type="dxa" w:w="1608"/>
-            <w:vAlign w:val="center"/>
-          </w:tcPr>
-          <w:p>
-            <w:pPr>
-              <w:jc w:val="right"/>
-            </w:pPr>
-            <w:r>
-              <w:rPr>
-                <w:rFonts w:ascii="Times New Roman" w:hAnsi="Times New Roman"/>
-                <w:sz w:val="18"/>
-              </w:rPr>
-              <w:t>1.303</w:t>
-            </w:r>
-          </w:p>
-        </w:tc>
-        <w:tc>
-          <w:tcPr>
-            <w:tcW w:type="dxa" w:w="1608"/>
-            <w:vAlign w:val="center"/>
-          </w:tcPr>
-          <w:p>
-            <w:pPr>
-              <w:jc w:val="right"/>
-            </w:pPr>
-            <w:r>
-              <w:rPr>
-                <w:rFonts w:ascii="Times New Roman" w:hAnsi="Times New Roman"/>
-                <w:sz w:val="18"/>
-              </w:rPr>
-              <w:t>0.01</w:t>
+              <w:t>0.956</w:t>
             </w:r>
           </w:p>
         </w:tc>
@@ -2106,8 +1126,8 @@
       <w:r>
         <w:drawing>
           <wp:inline xmlns:a="http://schemas.openxmlformats.org/drawingml/2006/main" xmlns:pic="http://schemas.openxmlformats.org/drawingml/2006/picture">
-            <wp:extent cx="5303520" cy="3333999"/>
-            <wp:docPr id="6" name="Picture 6"/>
+            <wp:extent cx="5669280" cy="3464560"/>
+            <wp:docPr id="4" name="Picture 4"/>
             <wp:cNvGraphicFramePr>
               <a:graphicFrameLocks noChangeAspect="1"/>
             </wp:cNvGraphicFramePr>
@@ -2119,7 +1139,7 @@
                     <pic:cNvPicPr/>
                   </pic:nvPicPr>
                   <pic:blipFill>
-                    <a:blip r:embed="rId15"/>
+                    <a:blip r:embed="rId12"/>
                     <a:stretch>
                       <a:fillRect/>
                     </a:stretch>
@@ -2127,7 +1147,7 @@
                   <pic:spPr>
                     <a:xfrm>
                       <a:off x="0" y="0"/>
-                      <a:ext cx="5303520" cy="3333999"/>
+                      <a:ext cx="5669280" cy="3464560"/>
                     </a:xfrm>
                     <a:prstGeom prst="rect"/>
                   </pic:spPr>
@@ -2140,20 +1160,134 @@
     </w:p>
     <w:p>
       <w:pPr>
-        <w:spacing w:after="240"/>
         <w:jc w:val="center"/>
       </w:pPr>
       <w:r>
         <w:rPr>
-          <w:rFonts w:ascii="Times New Roman" w:hAnsi="Times New Roman"/>
-          <w:sz w:val="20"/>
+          <w:i/>
+          <w:sz w:val="18"/>
         </w:rPr>
-        <w:t>Figure 6: Comparison of test RMSE across all trained models.</w:t>
+        <w:t>Figure 4. Test RMSE by model. Lower is better.</w:t>
+      </w:r>
+    </w:p>
+    <w:p>
+      <w:pPr>
+        <w:jc w:val="center"/>
+      </w:pPr>
+      <w:r>
+        <w:drawing>
+          <wp:inline xmlns:a="http://schemas.openxmlformats.org/drawingml/2006/main" xmlns:pic="http://schemas.openxmlformats.org/drawingml/2006/picture">
+            <wp:extent cx="5852160" cy="3889446"/>
+            <wp:docPr id="5" name="Picture 5"/>
+            <wp:cNvGraphicFramePr>
+              <a:graphicFrameLocks noChangeAspect="1"/>
+            </wp:cNvGraphicFramePr>
+            <a:graphic>
+              <a:graphicData uri="http://schemas.openxmlformats.org/drawingml/2006/picture">
+                <pic:pic>
+                  <pic:nvPicPr>
+                    <pic:cNvPr id="0" name="model_metrics_grid.png"/>
+                    <pic:cNvPicPr/>
+                  </pic:nvPicPr>
+                  <pic:blipFill>
+                    <a:blip r:embed="rId13"/>
+                    <a:stretch>
+                      <a:fillRect/>
+                    </a:stretch>
+                  </pic:blipFill>
+                  <pic:spPr>
+                    <a:xfrm>
+                      <a:off x="0" y="0"/>
+                      <a:ext cx="5852160" cy="3889446"/>
+                    </a:xfrm>
+                    <a:prstGeom prst="rect"/>
+                  </pic:spPr>
+                </pic:pic>
+              </a:graphicData>
+            </a:graphic>
+          </wp:inline>
+        </w:drawing>
+      </w:r>
+    </w:p>
+    <w:p>
+      <w:pPr>
+        <w:jc w:val="center"/>
+      </w:pPr>
+      <w:r>
+        <w:rPr>
+          <w:i/>
+          <w:sz w:val="18"/>
+        </w:rPr>
+        <w:t>Figure 5. Model comparison across RMSE, MAE, RMSLE, and R2.</w:t>
+      </w:r>
+    </w:p>
+    <w:p>
+      <w:pPr>
+        <w:jc w:val="center"/>
+      </w:pPr>
+      <w:r>
+        <w:drawing>
+          <wp:inline xmlns:a="http://schemas.openxmlformats.org/drawingml/2006/main" xmlns:pic="http://schemas.openxmlformats.org/drawingml/2006/picture">
+            <wp:extent cx="5852160" cy="6502764"/>
+            <wp:docPr id="6" name="Picture 6"/>
+            <wp:cNvGraphicFramePr>
+              <a:graphicFrameLocks noChangeAspect="1"/>
+            </wp:cNvGraphicFramePr>
+            <a:graphic>
+              <a:graphicData uri="http://schemas.openxmlformats.org/drawingml/2006/picture">
+                <pic:pic>
+                  <pic:nvPicPr>
+                    <pic:cNvPr id="0" name="predicted_vs_actual_grid.png"/>
+                    <pic:cNvPicPr/>
+                  </pic:nvPicPr>
+                  <pic:blipFill>
+                    <a:blip r:embed="rId14"/>
+                    <a:stretch>
+                      <a:fillRect/>
+                    </a:stretch>
+                  </pic:blipFill>
+                  <pic:spPr>
+                    <a:xfrm>
+                      <a:off x="0" y="0"/>
+                      <a:ext cx="5852160" cy="6502764"/>
+                    </a:xfrm>
+                    <a:prstGeom prst="rect"/>
+                  </pic:spPr>
+                </pic:pic>
+              </a:graphicData>
+            </a:graphic>
+          </wp:inline>
+        </w:drawing>
+      </w:r>
+    </w:p>
+    <w:p>
+      <w:pPr>
+        <w:jc w:val="center"/>
+      </w:pPr>
+      <w:r>
+        <w:rPr>
+          <w:i/>
+          <w:sz w:val="18"/>
+        </w:rPr>
+        <w:t>Figure 6. Predicted versus actual approved amount. Axes start at $1K and use a log scale.</w:t>
+      </w:r>
+    </w:p>
+    <w:p>
+      <w:pPr>
+        <w:pStyle w:val="Heading2"/>
+      </w:pPr>
+      <w:r>
+        <w:t>Model Performance Interpretation</w:t>
       </w:r>
     </w:p>
     <w:p>
       <w:r>
-        <w:br w:type="page"/>
+        <w:t>The model is performing moderately well, not perfectly. The boosted and tree-based models capture the overall upward relationship between actual and predicted approved amount. However, the scatter plots show regression toward the middle: small loans are often over-predicted and very large loans are often under-predicted.</w:t>
+      </w:r>
+    </w:p>
+    <w:p>
+      <w:r>
+        <w:t>This pattern is expected because the dataset does not include some major real-world approval drivers, such as requested loan amount, borrower revenue, collateral, credit profile, debt-service capacity, or lender-specific underwriting rules. The model is useful for estimating broad approval ranges, but it should not be presented as a precise production loan-pricing system.</w:t>
       </w:r>
     </w:p>
     <w:p>
@@ -2161,25 +1295,103 @@
         <w:pStyle w:val="Heading1"/>
       </w:pPr>
       <w:r>
-        <w:t>Model Analysis:</w:t>
+        <w:t>6. Discussion</w:t>
       </w:r>
     </w:p>
     <w:p>
       <w:pPr>
-        <w:spacing w:after="160"/>
-        <w:jc w:val="both"/>
+        <w:pStyle w:val="Heading2"/>
       </w:pPr>
       <w:r>
-        <w:t>LightGBM is the best model by RMSE. XGBoost and HistGradientBoosting are close, which confirms that boosted tree methods are a good match for this SBA loan amount task. Random Forest and CatBoost also perform well, while simple linear models trail because the relationship between loan amount, term, business size, geography, and industry is not purely linear.</w:t>
+        <w:t>Limitations</w:t>
       </w:r>
     </w:p>
     <w:p>
       <w:pPr>
-        <w:spacing w:after="160"/>
-        <w:jc w:val="both"/>
+        <w:pStyle w:val="ListBullet"/>
       </w:pPr>
       <w:r>
-        <w:t>The dummy baseline has a negative R2, meaning it performs worse than a useful model should. The boosted models provide a clear improvement, but the remaining error shows that the SBA data does not include every approval factor. Important missing predictors may include requested amount, business revenue, owner credit profile, collateral, and lender-specific policy details.</w:t>
+        <w:t>The target is highly skewed, so large loans have a strong effect on RMSE.</w:t>
+      </w:r>
+    </w:p>
+    <w:p>
+      <w:pPr>
+        <w:pStyle w:val="ListBullet"/>
+      </w:pPr>
+      <w:r>
+        <w:t>Important borrower-level underwriting variables are missing from the dataset.</w:t>
+      </w:r>
+    </w:p>
+    <w:p>
+      <w:pPr>
+        <w:pStyle w:val="ListBullet"/>
+      </w:pPr>
+      <w:r>
+        <w:t>Some SBA columns are historical administrative fields rather than direct application features.</w:t>
+      </w:r>
+    </w:p>
+    <w:p>
+      <w:pPr>
+        <w:pStyle w:val="ListBullet"/>
+      </w:pPr>
+      <w:r>
+        <w:t>A random split may slightly overstate real-world performance compared with a time-based split.</w:t>
+      </w:r>
+    </w:p>
+    <w:p>
+      <w:pPr>
+        <w:pStyle w:val="ListBullet"/>
+      </w:pPr>
+      <w:r>
+        <w:t>Predictions are less reliable at the smallest and largest ends of the loan amount range.</w:t>
+      </w:r>
+    </w:p>
+    <w:p>
+      <w:pPr>
+        <w:pStyle w:val="Heading2"/>
+      </w:pPr>
+      <w:r>
+        <w:t>Potential Improvements</w:t>
+      </w:r>
+    </w:p>
+    <w:p>
+      <w:pPr>
+        <w:pStyle w:val="ListBullet"/>
+      </w:pPr>
+      <w:r>
+        <w:t>Tune the top three models, especially LightGBM, XGBoost, and HistGradientBoosting.</w:t>
+      </w:r>
+    </w:p>
+    <w:p>
+      <w:pPr>
+        <w:pStyle w:val="ListBullet"/>
+      </w:pPr>
+      <w:r>
+        <w:t>Try time-based validation by training on older approvals and testing on newer approvals.</w:t>
+      </w:r>
+    </w:p>
+    <w:p>
+      <w:pPr>
+        <w:pStyle w:val="ListBullet"/>
+      </w:pPr>
+      <w:r>
+        <w:t>Add richer target-segment analysis for small, medium, and large loans.</w:t>
+      </w:r>
+    </w:p>
+    <w:p>
+      <w:pPr>
+        <w:pStyle w:val="ListBullet"/>
+      </w:pPr>
+      <w:r>
+        <w:t>Use native categorical handling in CatBoost and LightGBM instead of only one-hot encoding.</w:t>
+      </w:r>
+    </w:p>
+    <w:p>
+      <w:pPr>
+        <w:pStyle w:val="ListBullet"/>
+      </w:pPr>
+      <w:r>
+        <w:t>Save trained models and build a small prediction interface for demonstration.</w:t>
       </w:r>
     </w:p>
     <w:p>
@@ -2187,56 +1399,162 @@
         <w:pStyle w:val="Heading1"/>
       </w:pPr>
       <w:r>
-        <w:t>Conclusion:</w:t>
+        <w:t>7. Demonstration and Setup Instructions</w:t>
+      </w:r>
+    </w:p>
+    <w:p>
+      <w:r>
+        <w:t>To reproduce the project:</w:t>
       </w:r>
     </w:p>
     <w:p>
       <w:pPr>
-        <w:spacing w:after="160"/>
-        <w:jc w:val="both"/>
+        <w:pStyle w:val="ListNumber"/>
       </w:pPr>
       <w:r>
-        <w:t>The project was successfully changed from the earlier loan sanction dataset to the SBA National dataset while keeping the overall regression goal. The preprocessing now matches SBA loan records, leakage columns are removed, missing values are handled by feature type, and the model section has been expanded with stronger tabular models.</w:t>
+        <w:t>Create and activate the project virtual environment.</w:t>
       </w:r>
     </w:p>
     <w:p>
       <w:pPr>
-        <w:spacing w:after="160"/>
-        <w:jc w:val="both"/>
+        <w:pStyle w:val="ListNumber"/>
       </w:pPr>
       <w:r>
-        <w:t>The final recommendation is to use LightGBM as the main model for this notebook because it has the lowest RMSE and strong overall accuracy with fast training time. Future work should test a time-based validation split, tune boosted model hyperparameters, evaluate errors by state and industry sector, and add richer borrower or business financial features if they become available.</w:t>
+        <w:t>Install dependencies from requirements.txt.</w:t>
+      </w:r>
+    </w:p>
+    <w:p>
+      <w:pPr>
+        <w:pStyle w:val="ListNumber"/>
+      </w:pPr>
+      <w:r>
+        <w:t>Open src/LendWise.ipynb in Jupyter.</w:t>
+      </w:r>
+    </w:p>
+    <w:p>
+      <w:pPr>
+        <w:pStyle w:val="ListNumber"/>
+      </w:pPr>
+      <w:r>
+        <w:t>Run the dataset download cell if src/data/SBAnational.csv is missing.</w:t>
+      </w:r>
+    </w:p>
+    <w:p>
+      <w:pPr>
+        <w:pStyle w:val="ListNumber"/>
+      </w:pPr>
+      <w:r>
+        <w:t>Run all cells to reproduce preprocessing, model training, evaluation tables, and plots.</w:t>
+      </w:r>
+    </w:p>
+    <w:p>
+      <w:r>
+        <w:t>Expected generated files include src/data/model_results.csv and report figures under reports/assets/.</w:t>
+      </w:r>
+    </w:p>
+    <w:p>
+      <w:pPr>
+        <w:pStyle w:val="Heading1"/>
+      </w:pPr>
+      <w:r>
+        <w:t>8. Conclusion</w:t>
+      </w:r>
+    </w:p>
+    <w:p>
+      <w:r>
+        <w:t>The project successfully converts LendWise into an SBA approved loan amount regression system. The preprocessing now matches SBA lending data, leakage columns are removed, engineered features are added, and multiple models are evaluated fairly on the same test set.</w:t>
+      </w:r>
+    </w:p>
+    <w:p>
+      <w:r>
+        <w:t>LightGBM is the final recommended model because it has the lowest RMSE and the highest R2 among the tested models. The result is useful for broad loan amount estimation, while the remaining error shows that exact approval prediction requires additional borrower and underwriting data.</w:t>
+      </w:r>
+    </w:p>
+    <w:p>
+      <w:pPr>
+        <w:pStyle w:val="Heading2"/>
+      </w:pPr>
+      <w:r>
+        <w:t>Individual Contribution</w:t>
+      </w:r>
+    </w:p>
+    <w:p>
+      <w:r>
+        <w:t>Deepak completed the dataset change to SBA National, preprocessing redesign, feature engineering, model training, GPU setup, evaluation updates, plot diagnostics, and report preparation. This section can be edited if additional team members need to be listed.</w:t>
+      </w:r>
+    </w:p>
+    <w:p>
+      <w:pPr>
+        <w:pStyle w:val="Heading1"/>
+      </w:pPr>
+      <w:r>
+        <w:t>9. References</w:t>
+      </w:r>
+    </w:p>
+    <w:p>
+      <w:pPr>
+        <w:pStyle w:val="ListBullet"/>
+      </w:pPr>
+      <w:r>
+        <w:t>SBA National Loan Dataset. Kaggle. https://www.kaggle.com/datasets/maddraf/sbanational-csv</w:t>
+      </w:r>
+    </w:p>
+    <w:p>
+      <w:pPr>
+        <w:pStyle w:val="ListBullet"/>
+      </w:pPr>
+      <w:r>
+        <w:t>U.S. Small Business Administration. 7(a) Loan Program overview. https://www.sba.gov/funding-programs/loans/7a-loans</w:t>
+      </w:r>
+    </w:p>
+    <w:p>
+      <w:pPr>
+        <w:pStyle w:val="ListBullet"/>
+      </w:pPr>
+      <w:r>
+        <w:t>scikit-learn documentation. https://scikit-learn.org/stable/</w:t>
+      </w:r>
+    </w:p>
+    <w:p>
+      <w:pPr>
+        <w:pStyle w:val="ListBullet"/>
+      </w:pPr>
+      <w:r>
+        <w:t>LightGBM documentation. https://lightgbm.readthedocs.io/</w:t>
+      </w:r>
+    </w:p>
+    <w:p>
+      <w:pPr>
+        <w:pStyle w:val="ListBullet"/>
+      </w:pPr>
+      <w:r>
+        <w:t>XGBoost documentation. https://xgboost.readthedocs.io/</w:t>
+      </w:r>
+    </w:p>
+    <w:p>
+      <w:pPr>
+        <w:pStyle w:val="ListBullet"/>
+      </w:pPr>
+      <w:r>
+        <w:t>CatBoost documentation. https://catboost.ai/</w:t>
+      </w:r>
+    </w:p>
+    <w:p>
+      <w:pPr>
+        <w:pStyle w:val="ListBullet"/>
+      </w:pPr>
+      <w:r>
+        <w:t>TensorFlow documentation. https://www.tensorflow.org/</w:t>
       </w:r>
     </w:p>
     <w:sectPr>
-      <w:footerReference w:type="default" r:id="rId9"/>
       <w:pgSz w:w="12240" w:h="15840"/>
-      <w:pgMar w:top="1296" w:right="1296" w:bottom="1152" w:left="1296" w:header="720" w:footer="504" w:gutter="0"/>
+      <w:pgMar w:top="1008" w:right="1080" w:bottom="1008" w:left="1080" w:header="720" w:footer="720" w:gutter="0"/>
       <w:cols w:space="720"/>
       <w:docGrid w:linePitch="360"/>
     </w:sectPr>
   </w:body>
 </w:document>
-</file>
-
-<file path=word/footer1.xml><?xml version="1.0" encoding="utf-8"?>
-<w:ftr xmlns:m="http://schemas.openxmlformats.org/officeDocument/2006/math" xmlns:mc="http://schemas.openxmlformats.org/markup-compatibility/2006" xmlns:mo="http://schemas.microsoft.com/office/mac/office/2008/main" xmlns:mv="urn:schemas-microsoft-com:mac:vml" xmlns:o="urn:schemas-microsoft-com:office:office" xmlns:r="http://schemas.openxmlformats.org/officeDocument/2006/relationships" xmlns:v="urn:schemas-microsoft-com:vml" xmlns:w10="urn:schemas-microsoft-com:office:word" xmlns:w14="http://schemas.microsoft.com/office/word/2010/wordml" xmlns:w="http://schemas.openxmlformats.org/wordprocessingml/2006/main" xmlns:wne="http://schemas.microsoft.com/office/word/2006/wordml" xmlns:wp14="http://schemas.microsoft.com/office/word/2010/wordprocessingDrawing" xmlns:wp="http://schemas.openxmlformats.org/drawingml/2006/wordprocessingDrawing" xmlns:wpc="http://schemas.microsoft.com/office/word/2010/wordprocessingCanvas" xmlns:wpg="http://schemas.microsoft.com/office/word/2010/wordprocessingGroup" xmlns:wpi="http://schemas.microsoft.com/office/word/2010/wordprocessingInk" xmlns:wps="http://schemas.microsoft.com/office/word/2010/wordprocessingShape" mc:Ignorable="w14 wp14">
-  <w:p>
-    <w:pPr>
-      <w:pStyle w:val="Footer"/>
-      <w:jc w:val="center"/>
-    </w:pPr>
-    <w:r>
-      <w:rPr>
-        <w:rFonts w:ascii="Times New Roman" w:hAnsi="Times New Roman"/>
-        <w:sz w:val="24"/>
-      </w:rPr>
-      <w:fldChar w:fldCharType="begin"/>
-      <w:instrText xml:space="preserve">PAGE</w:instrText>
-      <w:fldChar w:fldCharType="end"/>
-    </w:r>
-  </w:p>
-</w:ftr>
 </file>
 
 <file path=word/numbering.xml><?xml version="1.0" encoding="utf-8"?>
@@ -2603,9 +1921,8 @@
     <w:qFormat/>
     <w:rsid w:val="00FC693F"/>
     <w:rPr>
-      <w:rFonts w:ascii="Times New Roman" w:hAnsi="Times New Roman" w:eastAsia="Times New Roman"/>
-      <w:b w:val="0"/>
-      <w:sz w:val="24"/>
+      <w:rFonts w:ascii="Calibri" w:hAnsi="Calibri"/>
+      <w:sz w:val="21"/>
     </w:rPr>
   </w:style>
   <w:style w:type="paragraph" w:styleId="Header">
@@ -2667,11 +1984,11 @@
       <w:outlineLvl w:val="0"/>
     </w:pPr>
     <w:rPr>
-      <w:rFonts w:asciiTheme="majorHAnsi" w:eastAsiaTheme="majorEastAsia" w:hAnsiTheme="majorHAnsi" w:cstheme="majorBidi" w:ascii="Times New Roman" w:hAnsi="Times New Roman" w:eastAsia="Times New Roman"/>
+      <w:rFonts w:asciiTheme="majorHAnsi" w:eastAsiaTheme="majorEastAsia" w:hAnsiTheme="majorHAnsi" w:cstheme="majorBidi" w:ascii="Calibri" w:hAnsi="Calibri"/>
       <w:b/>
       <w:bCs/>
       <w:color w:val="365F91" w:themeColor="accent1" w:themeShade="BF"/>
-      <w:sz w:val="36"/>
+      <w:sz w:val="28"/>
       <w:szCs w:val="28"/>
     </w:rPr>
   </w:style>
@@ -2691,11 +2008,11 @@
       <w:outlineLvl w:val="1"/>
     </w:pPr>
     <w:rPr>
-      <w:rFonts w:asciiTheme="majorHAnsi" w:eastAsiaTheme="majorEastAsia" w:hAnsiTheme="majorHAnsi" w:cstheme="majorBidi" w:ascii="Times New Roman" w:hAnsi="Times New Roman" w:eastAsia="Times New Roman"/>
+      <w:rFonts w:asciiTheme="majorHAnsi" w:eastAsiaTheme="majorEastAsia" w:hAnsiTheme="majorHAnsi" w:cstheme="majorBidi" w:ascii="Calibri" w:hAnsi="Calibri"/>
       <w:b/>
       <w:bCs/>
       <w:color w:val="4F81BD" w:themeColor="accent1"/>
-      <w:sz w:val="28"/>
+      <w:sz w:val="26"/>
       <w:szCs w:val="26"/>
     </w:rPr>
   </w:style>
@@ -2956,12 +2273,11 @@
       <w:contextualSpacing/>
     </w:pPr>
     <w:rPr>
-      <w:rFonts w:asciiTheme="majorHAnsi" w:eastAsiaTheme="majorEastAsia" w:hAnsiTheme="majorHAnsi" w:cstheme="majorBidi" w:ascii="Times New Roman" w:hAnsi="Times New Roman" w:eastAsia="Times New Roman"/>
-      <w:b/>
+      <w:rFonts w:asciiTheme="majorHAnsi" w:eastAsiaTheme="majorEastAsia" w:hAnsiTheme="majorHAnsi" w:cstheme="majorBidi" w:ascii="Calibri" w:hAnsi="Calibri"/>
       <w:color w:val="17365D" w:themeColor="text2" w:themeShade="BF"/>
       <w:spacing w:val="5"/>
       <w:kern w:val="28"/>
-      <w:sz w:val="50"/>
+      <w:sz w:val="52"/>
       <w:szCs w:val="52"/>
     </w:rPr>
   </w:style>
@@ -3137,11 +2453,6 @@
       </w:numPr>
       <w:contextualSpacing/>
     </w:pPr>
-    <w:rPr>
-      <w:rFonts w:ascii="Times New Roman" w:hAnsi="Times New Roman" w:eastAsia="Times New Roman"/>
-      <w:b w:val="0"/>
-      <w:sz w:val="24"/>
-    </w:rPr>
   </w:style>
   <w:style w:type="paragraph" w:styleId="ListBullet2">
     <w:name w:val="List Bullet 2"/>
@@ -3404,11 +2715,10 @@
       <w:spacing w:line="240" w:lineRule="auto"/>
     </w:pPr>
     <w:rPr>
-      <w:rFonts w:ascii="Times New Roman" w:hAnsi="Times New Roman" w:eastAsia="Times New Roman"/>
-      <w:b w:val="0"/>
+      <w:b/>
       <w:bCs/>
       <w:color w:val="4F81BD" w:themeColor="accent1"/>
-      <w:sz w:val="20"/>
+      <w:sz w:val="18"/>
       <w:szCs w:val="18"/>
     </w:rPr>
   </w:style>

</xml_diff>

<commit_message>
Added segment wise tuning
</commit_message>
<xml_diff>
--- a/reports/SBA_LendWise_Report.docx
+++ b/reports/SBA_LendWise_Report.docx
@@ -32,20 +32,12 @@
       <w:r>
         <w:t>Student: Deepak</w:t>
         <w:br/>
-      </w:r>
-      <w:r>
         <w:t>Course: CS5100 / CSE 587B Final Project</w:t>
         <w:br/>
-      </w:r>
-      <w:r>
         <w:t>Date: August 7, 2026</w:t>
         <w:br/>
-      </w:r>
-      <w:r>
         <w:t>Dataset: SBA National Loan Dataset</w:t>
         <w:br/>
-      </w:r>
-      <w:r>
         <w:t>Target: GrAppv, the gross approved loan amount</w:t>
       </w:r>
     </w:p>
@@ -84,7 +76,7 @@
     </w:p>
     <w:p>
       <w:r>
-        <w:t>This project predicts the approved dollar amount for small business loans using the SBA National Loan Dataset. The target variable is GrAppv, the gross amount approved by the lender. The project is a regression task, not a default-risk classification task.</w:t>
+        <w:t>This project predicts the approved dollar amount for small business loans using the SBA National Loan Dataset. The target variable is GrAppv, the gross amount approved by the lender. The project is a regression task.</w:t>
       </w:r>
     </w:p>
     <w:p>
@@ -97,12 +89,12 @@
     </w:p>
     <w:p>
       <w:r>
-        <w:t>Small business lending decisions depend on many signals, including loan term, business size, state, lender location, industry, program flags, and whether the business is new or existing. A model that estimates an expected approved amount can help borrowers set realistic expectations and can help lenders identify applications that may need closer review.</w:t>
+        <w:t>Small business lending decisions depend on loan term, business size, state, lender location, industry, program flags, and whether the business is new or existing. A model that estimates an expected approved amount can help borrowers set realistic expectations and can help lenders identify unusual cases for closer review.</w:t>
       </w:r>
     </w:p>
     <w:p>
       <w:r>
-        <w:t>The main goal is to build a clean, reproducible machine learning workflow that predicts approved SBA loan amount and compares several regression models using consistent evaluation metrics.</w:t>
+        <w:t>The main goal is to build a clean and reproducible machine learning workflow that predicts approved SBA loan amount and compares several regression models using consistent evaluation metrics.</w:t>
       </w:r>
     </w:p>
     <w:p>
@@ -115,12 +107,12 @@
     </w:p>
     <w:p>
       <w:r>
-        <w:t>The SBA 7(a)-style lending data is useful for predictive analytics because it contains historical lending records across many banks, states, industries, and years. Approved amount is highly skewed: many loans are small or medium sized, while a smaller number of very large loans pull the mean upward. This makes the task harder than a simple linear prediction problem.</w:t>
+        <w:t>The SBA lending data contains historical records across banks, states, industries, and years. Approved amount is highly skewed: many loans are small or medium sized, while a smaller number of very large loans pull the mean upward. This makes the task harder than a simple linear prediction problem.</w:t>
       </w:r>
     </w:p>
     <w:p>
       <w:r>
-        <w:t>The project uses supervised regression. Linear models provide simple baselines, while tree-based ensemble models can learn nonlinear relationships and interactions between features. Boosted tree models such as LightGBM, XGBoost, HistGradientBoosting, and CatBoost are especially useful for tabular data because they handle nonlinear patterns well.</w:t>
+        <w:t>The project uses supervised regression. Linear models provide simple baselines, while tree-based ensemble models can learn nonlinear relationships and interactions between features. Boosted tree models such as LightGBM, XGBoost, HistGradientBoosting, and CatBoost are useful for tabular data because they handle nonlinear patterns well.</w:t>
       </w:r>
     </w:p>
     <w:p>
@@ -168,7 +160,7 @@
         <w:pStyle w:val="ListBullet"/>
       </w:pPr>
       <w:r>
-        <w:t>TensorFlow/Keras for the neural network model, with GPU support enabled in the project environment</w:t>
+        <w:t>TensorFlow/Keras for the neural network model, with GPU support enabled</w:t>
       </w:r>
     </w:p>
     <w:p>
@@ -189,12 +181,12 @@
     </w:p>
     <w:p>
       <w:r>
-        <w:t>The raw SBA file contains 899,164 rows and 27 columns before setting the loan number as the index. After target cleanup, 899,164 usable rows remain because the target field is present and positive for the records used here.</w:t>
+        <w:t>The raw SBA file contains 899,164 rows and 27 columns before setting the loan number as the index. After target cleanup, 899,164 usable rows remain.</w:t>
       </w:r>
     </w:p>
     <w:p>
       <w:r>
-        <w:t>The model intentionally excludes post-approval performance fields and direct leakage fields such as SBA_Appv, DisbursementGross, MIS_Status, ChgOffPrinGr, and charge-off dates. This keeps the project focused on predicting the approved amount from information that would be more reasonable to know near approval time.</w:t>
+        <w:t>The model intentionally excludes post-approval performance fields and direct leakage fields such as SBA_Appv, DisbursementGross, MIS_Status, ChgOffPrinGr, and charge-off dates. This keeps the project focused on predicting approved amount from fields that are more reasonable near approval time.</w:t>
       </w:r>
     </w:p>
     <w:p>
@@ -277,31 +269,7 @@
         <w:pStyle w:val="ListNumber"/>
       </w:pPr>
       <w:r>
-        <w:t>Created term features such as term_years, is_long_term, and is_very_long_term.</w:t>
-      </w:r>
-    </w:p>
-    <w:p>
-      <w:pPr>
-        <w:pStyle w:val="ListNumber"/>
-      </w:pPr>
-      <w:r>
-        <w:t>Created employment features such as total_jobs_supported, job_creation_ratio, and retained_job_ratio.</w:t>
-      </w:r>
-    </w:p>
-    <w:p>
-      <w:pPr>
-        <w:pStyle w:val="ListNumber"/>
-      </w:pPr>
-      <w:r>
-        <w:t>Converted NAICS into broad sector and capped 3-digit industry group features.</w:t>
-      </w:r>
-    </w:p>
-    <w:p>
-      <w:pPr>
-        <w:pStyle w:val="ListNumber"/>
-      </w:pPr>
-      <w:r>
-        <w:t>Created geographic and lender features such as Zip3, same_state_bank, city frequency, zip frequency, bank frequency, top city group, and top bank group.</w:t>
+        <w:t>Created term features, employment features, job ratios, industry groups, geography features, and lender features.</w:t>
       </w:r>
     </w:p>
     <w:p>
@@ -492,7 +460,7 @@
     </w:p>
     <w:p>
       <w:r>
-        <w:t>The neural network cell now checks for TensorFlow GPU availability and enables memory growth when a GPU is found. In the final run, TensorFlow detected the NVIDIA GeForce RTX 4060 Laptop GPU.</w:t>
+        <w:t>The neural network cell checks for TensorFlow GPU availability and enables memory growth when a GPU is found. In the final run, TensorFlow detected the NVIDIA GeForce RTX 4060 Laptop GPU.</w:t>
       </w:r>
     </w:p>
     <w:p>
@@ -1277,17 +1245,483 @@
         <w:pStyle w:val="Heading2"/>
       </w:pPr>
       <w:r>
-        <w:t>Model Performance Interpretation</w:t>
+        <w:t>Validation by Loan Size</w:t>
       </w:r>
     </w:p>
     <w:p>
       <w:r>
-        <w:t>The model is performing moderately well, not perfectly. The boosted and tree-based models capture the overall upward relationship between actual and predicted approved amount. However, the scatter plots show regression toward the middle: small loans are often over-predicted and very large loans are often under-predicted.</w:t>
+        <w:t>The overall RMSE hides important differences across loan sizes. The test set was split into three groups: small loans below $50K, medium loans from $50K to $250K, and large loans above $250K. This shows whether the model is equally reliable across the target range.</w:t>
+      </w:r>
+    </w:p>
+    <w:tbl>
+      <w:tblPr>
+        <w:tblStyle w:val="TableGrid"/>
+        <w:tblW w:type="auto" w:w="0"/>
+        <w:jc w:val="center"/>
+        <w:tblLook w:firstColumn="1" w:firstRow="1" w:lastColumn="0" w:lastRow="0" w:noHBand="0" w:noVBand="1" w:val="04A0"/>
+      </w:tblPr>
+      <w:tblGrid>
+        <w:gridCol w:w="1680"/>
+        <w:gridCol w:w="1680"/>
+        <w:gridCol w:w="1680"/>
+        <w:gridCol w:w="1680"/>
+        <w:gridCol w:w="1680"/>
+        <w:gridCol w:w="1680"/>
+      </w:tblGrid>
+      <w:tr>
+        <w:tc>
+          <w:tcPr>
+            <w:tcW w:type="dxa" w:w="1680"/>
+            <w:vAlign w:val="center"/>
+            <w:shd w:fill="D9EAD3"/>
+          </w:tcPr>
+          <w:p>
+            <w:r/>
+            <w:r>
+              <w:rPr>
+                <w:b/>
+                <w:sz w:val="18"/>
+              </w:rPr>
+              <w:t>Loan Size</w:t>
+            </w:r>
+          </w:p>
+        </w:tc>
+        <w:tc>
+          <w:tcPr>
+            <w:tcW w:type="dxa" w:w="1680"/>
+            <w:vAlign w:val="center"/>
+            <w:shd w:fill="D9EAD3"/>
+          </w:tcPr>
+          <w:p>
+            <w:r/>
+            <w:r>
+              <w:rPr>
+                <w:b/>
+                <w:sz w:val="18"/>
+              </w:rPr>
+              <w:t>Rows</w:t>
+            </w:r>
+          </w:p>
+        </w:tc>
+        <w:tc>
+          <w:tcPr>
+            <w:tcW w:type="dxa" w:w="1680"/>
+            <w:vAlign w:val="center"/>
+            <w:shd w:fill="D9EAD3"/>
+          </w:tcPr>
+          <w:p>
+            <w:r/>
+            <w:r>
+              <w:rPr>
+                <w:b/>
+                <w:sz w:val="18"/>
+              </w:rPr>
+              <w:t>MAE</w:t>
+            </w:r>
+          </w:p>
+        </w:tc>
+        <w:tc>
+          <w:tcPr>
+            <w:tcW w:type="dxa" w:w="1680"/>
+            <w:vAlign w:val="center"/>
+            <w:shd w:fill="D9EAD3"/>
+          </w:tcPr>
+          <w:p>
+            <w:r/>
+            <w:r>
+              <w:rPr>
+                <w:b/>
+                <w:sz w:val="18"/>
+              </w:rPr>
+              <w:t>RMSE</w:t>
+            </w:r>
+          </w:p>
+        </w:tc>
+        <w:tc>
+          <w:tcPr>
+            <w:tcW w:type="dxa" w:w="1680"/>
+            <w:vAlign w:val="center"/>
+            <w:shd w:fill="D9EAD3"/>
+          </w:tcPr>
+          <w:p>
+            <w:r/>
+            <w:r>
+              <w:rPr>
+                <w:b/>
+                <w:sz w:val="18"/>
+              </w:rPr>
+              <w:t>R2</w:t>
+            </w:r>
+          </w:p>
+        </w:tc>
+        <w:tc>
+          <w:tcPr>
+            <w:tcW w:type="dxa" w:w="1680"/>
+            <w:vAlign w:val="center"/>
+            <w:shd w:fill="D9EAD3"/>
+          </w:tcPr>
+          <w:p>
+            <w:r/>
+            <w:r>
+              <w:rPr>
+                <w:b/>
+                <w:sz w:val="18"/>
+              </w:rPr>
+              <w:t>Mean Error</w:t>
+            </w:r>
+          </w:p>
+        </w:tc>
+      </w:tr>
+      <w:tr>
+        <w:tc>
+          <w:tcPr>
+            <w:tcW w:type="dxa" w:w="1680"/>
+            <w:vAlign w:val="center"/>
+          </w:tcPr>
+          <w:p>
+            <w:r/>
+            <w:r>
+              <w:rPr>
+                <w:b w:val="0"/>
+                <w:sz w:val="18"/>
+              </w:rPr>
+              <w:t>Small (&lt;$50K)</w:t>
+            </w:r>
+          </w:p>
+        </w:tc>
+        <w:tc>
+          <w:tcPr>
+            <w:tcW w:type="dxa" w:w="1680"/>
+            <w:vAlign w:val="center"/>
+          </w:tcPr>
+          <w:p>
+            <w:r/>
+            <w:r>
+              <w:rPr>
+                <w:b w:val="0"/>
+                <w:sz w:val="18"/>
+              </w:rPr>
+              <w:t>69933</w:t>
+            </w:r>
+          </w:p>
+        </w:tc>
+        <w:tc>
+          <w:tcPr>
+            <w:tcW w:type="dxa" w:w="1680"/>
+            <w:vAlign w:val="center"/>
+          </w:tcPr>
+          <w:p>
+            <w:r/>
+            <w:r>
+              <w:rPr>
+                <w:b w:val="0"/>
+                <w:sz w:val="18"/>
+              </w:rPr>
+              <w:t>$35,805</w:t>
+            </w:r>
+          </w:p>
+        </w:tc>
+        <w:tc>
+          <w:tcPr>
+            <w:tcW w:type="dxa" w:w="1680"/>
+            <w:vAlign w:val="center"/>
+          </w:tcPr>
+          <w:p>
+            <w:r/>
+            <w:r>
+              <w:rPr>
+                <w:b w:val="0"/>
+                <w:sz w:val="18"/>
+              </w:rPr>
+              <w:t>$59,072</w:t>
+            </w:r>
+          </w:p>
+        </w:tc>
+        <w:tc>
+          <w:tcPr>
+            <w:tcW w:type="dxa" w:w="1680"/>
+            <w:vAlign w:val="center"/>
+          </w:tcPr>
+          <w:p>
+            <w:r/>
+            <w:r>
+              <w:rPr>
+                <w:b w:val="0"/>
+                <w:sz w:val="18"/>
+              </w:rPr>
+              <w:t>-14.673</w:t>
+            </w:r>
+          </w:p>
+        </w:tc>
+        <w:tc>
+          <w:tcPr>
+            <w:tcW w:type="dxa" w:w="1680"/>
+            <w:vAlign w:val="center"/>
+          </w:tcPr>
+          <w:p>
+            <w:r/>
+            <w:r>
+              <w:rPr>
+                <w:b w:val="0"/>
+                <w:sz w:val="18"/>
+              </w:rPr>
+              <w:t>$32,033</w:t>
+            </w:r>
+          </w:p>
+        </w:tc>
+      </w:tr>
+      <w:tr>
+        <w:tc>
+          <w:tcPr>
+            <w:tcW w:type="dxa" w:w="1680"/>
+            <w:vAlign w:val="center"/>
+          </w:tcPr>
+          <w:p>
+            <w:r/>
+            <w:r>
+              <w:rPr>
+                <w:b w:val="0"/>
+                <w:sz w:val="18"/>
+              </w:rPr>
+              <w:t>Medium ($50K-$250K)</w:t>
+            </w:r>
+          </w:p>
+        </w:tc>
+        <w:tc>
+          <w:tcPr>
+            <w:tcW w:type="dxa" w:w="1680"/>
+            <w:vAlign w:val="center"/>
+          </w:tcPr>
+          <w:p>
+            <w:r/>
+            <w:r>
+              <w:rPr>
+                <w:b w:val="0"/>
+                <w:sz w:val="18"/>
+              </w:rPr>
+              <w:t>70098</w:t>
+            </w:r>
+          </w:p>
+        </w:tc>
+        <w:tc>
+          <w:tcPr>
+            <w:tcW w:type="dxa" w:w="1680"/>
+            <w:vAlign w:val="center"/>
+          </w:tcPr>
+          <w:p>
+            <w:r/>
+            <w:r>
+              <w:rPr>
+                <w:b w:val="0"/>
+                <w:sz w:val="18"/>
+              </w:rPr>
+              <w:t>$83,430</w:t>
+            </w:r>
+          </w:p>
+        </w:tc>
+        <w:tc>
+          <w:tcPr>
+            <w:tcW w:type="dxa" w:w="1680"/>
+            <w:vAlign w:val="center"/>
+          </w:tcPr>
+          <w:p>
+            <w:r/>
+            <w:r>
+              <w:rPr>
+                <w:b w:val="0"/>
+                <w:sz w:val="18"/>
+              </w:rPr>
+              <w:t>$125,453</w:t>
+            </w:r>
+          </w:p>
+        </w:tc>
+        <w:tc>
+          <w:tcPr>
+            <w:tcW w:type="dxa" w:w="1680"/>
+            <w:vAlign w:val="center"/>
+          </w:tcPr>
+          <w:p>
+            <w:r/>
+            <w:r>
+              <w:rPr>
+                <w:b w:val="0"/>
+                <w:sz w:val="18"/>
+              </w:rPr>
+              <w:t>-4.256</w:t>
+            </w:r>
+          </w:p>
+        </w:tc>
+        <w:tc>
+          <w:tcPr>
+            <w:tcW w:type="dxa" w:w="1680"/>
+            <w:vAlign w:val="center"/>
+          </w:tcPr>
+          <w:p>
+            <w:r/>
+            <w:r>
+              <w:rPr>
+                <w:b w:val="0"/>
+                <w:sz w:val="18"/>
+              </w:rPr>
+              <w:t>$47,534</w:t>
+            </w:r>
+          </w:p>
+        </w:tc>
+      </w:tr>
+      <w:tr>
+        <w:tc>
+          <w:tcPr>
+            <w:tcW w:type="dxa" w:w="1680"/>
+            <w:vAlign w:val="center"/>
+          </w:tcPr>
+          <w:p>
+            <w:r/>
+            <w:r>
+              <w:rPr>
+                <w:b w:val="0"/>
+                <w:sz w:val="18"/>
+              </w:rPr>
+              <w:t>Large (&gt;$250K)</w:t>
+            </w:r>
+          </w:p>
+        </w:tc>
+        <w:tc>
+          <w:tcPr>
+            <w:tcW w:type="dxa" w:w="1680"/>
+            <w:vAlign w:val="center"/>
+          </w:tcPr>
+          <w:p>
+            <w:r/>
+            <w:r>
+              <w:rPr>
+                <w:b w:val="0"/>
+                <w:sz w:val="18"/>
+              </w:rPr>
+              <w:t>39802</w:t>
+            </w:r>
+          </w:p>
+        </w:tc>
+        <w:tc>
+          <w:tcPr>
+            <w:tcW w:type="dxa" w:w="1680"/>
+            <w:vAlign w:val="center"/>
+          </w:tcPr>
+          <w:p>
+            <w:r/>
+            <w:r>
+              <w:rPr>
+                <w:b w:val="0"/>
+                <w:sz w:val="18"/>
+              </w:rPr>
+              <w:t>$236,515</w:t>
+            </w:r>
+          </w:p>
+        </w:tc>
+        <w:tc>
+          <w:tcPr>
+            <w:tcW w:type="dxa" w:w="1680"/>
+            <w:vAlign w:val="center"/>
+          </w:tcPr>
+          <w:p>
+            <w:r/>
+            <w:r>
+              <w:rPr>
+                <w:b w:val="0"/>
+                <w:sz w:val="18"/>
+              </w:rPr>
+              <w:t>$347,369</w:t>
+            </w:r>
+          </w:p>
+        </w:tc>
+        <w:tc>
+          <w:tcPr>
+            <w:tcW w:type="dxa" w:w="1680"/>
+            <w:vAlign w:val="center"/>
+          </w:tcPr>
+          <w:p>
+            <w:r/>
+            <w:r>
+              <w:rPr>
+                <w:b w:val="0"/>
+                <w:sz w:val="18"/>
+              </w:rPr>
+              <w:t>0.135</w:t>
+            </w:r>
+          </w:p>
+        </w:tc>
+        <w:tc>
+          <w:tcPr>
+            <w:tcW w:type="dxa" w:w="1680"/>
+            <w:vAlign w:val="center"/>
+          </w:tcPr>
+          <w:p>
+            <w:r/>
+            <w:r>
+              <w:rPr>
+                <w:b w:val="0"/>
+                <w:sz w:val="18"/>
+              </w:rPr>
+              <w:t>$-140,322</w:t>
+            </w:r>
+          </w:p>
+        </w:tc>
+      </w:tr>
+    </w:tbl>
+    <w:p/>
+    <w:p>
+      <w:pPr>
+        <w:jc w:val="center"/>
+      </w:pPr>
+      <w:r>
+        <w:drawing>
+          <wp:inline xmlns:a="http://schemas.openxmlformats.org/drawingml/2006/main" xmlns:pic="http://schemas.openxmlformats.org/drawingml/2006/picture">
+            <wp:extent cx="5852160" cy="1913914"/>
+            <wp:docPr id="7" name="Picture 7"/>
+            <wp:cNvGraphicFramePr>
+              <a:graphicFrameLocks noChangeAspect="1"/>
+            </wp:cNvGraphicFramePr>
+            <a:graphic>
+              <a:graphicData uri="http://schemas.openxmlformats.org/drawingml/2006/picture">
+                <pic:pic>
+                  <pic:nvPicPr>
+                    <pic:cNvPr id="0" name="loan_size_validation.png"/>
+                    <pic:cNvPicPr/>
+                  </pic:nvPicPr>
+                  <pic:blipFill>
+                    <a:blip r:embed="rId15"/>
+                    <a:stretch>
+                      <a:fillRect/>
+                    </a:stretch>
+                  </pic:blipFill>
+                  <pic:spPr>
+                    <a:xfrm>
+                      <a:off x="0" y="0"/>
+                      <a:ext cx="5852160" cy="1913914"/>
+                    </a:xfrm>
+                    <a:prstGeom prst="rect"/>
+                  </pic:spPr>
+                </pic:pic>
+              </a:graphicData>
+            </a:graphic>
+          </wp:inline>
+        </w:drawing>
+      </w:r>
+    </w:p>
+    <w:p>
+      <w:pPr>
+        <w:jc w:val="center"/>
+      </w:pPr>
+      <w:r>
+        <w:rPr>
+          <w:i/>
+          <w:sz w:val="18"/>
+        </w:rPr>
+        <w:t>Figure 7. RMSE and average prediction bias by loan size for the top 5 models.</w:t>
       </w:r>
     </w:p>
     <w:p>
       <w:r>
-        <w:t>This pattern is expected because the dataset does not include some major real-world approval drivers, such as requested loan amount, borrower revenue, collateral, credit profile, debt-service capacity, or lender-specific underwriting rules. The model is useful for estimating broad approval ranges, but it should not be presented as a precise production loan-pricing system.</w:t>
+        <w:t>The loan-size validation shows that LightGBM over-predicts small and medium loans on average, but under-predicts large loans. This confirms the regression-toward-the-middle pattern seen in the scatter plots. The model is strongest as a broad estimator and weakest for exact prediction of very large approvals.</w:t>
       </w:r>
     </w:p>
     <w:p>
@@ -1375,7 +1809,7 @@
         <w:pStyle w:val="ListBullet"/>
       </w:pPr>
       <w:r>
-        <w:t>Add richer target-segment analysis for small, medium, and large loans.</w:t>
+        <w:t>Train separate models by loan-size segment or add a two-stage model that first predicts loan-size group.</w:t>
       </w:r>
     </w:p>
     <w:p>
@@ -1449,7 +1883,7 @@
     </w:p>
     <w:p>
       <w:r>
-        <w:t>Expected generated files include src/data/model_results.csv and report figures under reports/assets/.</w:t>
+        <w:t>Expected generated files include src/data/model_results.csv, src/data/model_results_by_loan_size.csv, and report figures under reports/assets/.</w:t>
       </w:r>
     </w:p>
     <w:p>
@@ -1480,7 +1914,7 @@
     </w:p>
     <w:p>
       <w:r>
-        <w:t>Deepak completed the dataset change to SBA National, preprocessing redesign, feature engineering, model training, GPU setup, evaluation updates, plot diagnostics, and report preparation. This section can be edited if additional team members need to be listed.</w:t>
+        <w:t>Deepak completed the dataset change to SBA National, preprocessing redesign, feature engineering, model training, GPU setup, evaluation updates, plot diagnostics, loan-size validation, and report preparation. This section can be edited if additional team members need to be listed.</w:t>
       </w:r>
     </w:p>
     <w:p>
@@ -1545,6 +1979,1407 @@
       </w:pPr>
       <w:r>
         <w:t>TensorFlow documentation. https://www.tensorflow.org/</w:t>
+      </w:r>
+    </w:p>
+    <w:p>
+      <w:r>
+        <w:br w:type="page"/>
+      </w:r>
+    </w:p>
+    <w:p>
+      <w:pPr>
+        <w:pStyle w:val="Heading1"/>
+      </w:pPr>
+      <w:r>
+        <w:t>Appendix: Split-Level Loan-Size Accuracy</w:t>
+      </w:r>
+    </w:p>
+    <w:p>
+      <w:r>
+        <w:t>Regression does not use classification accuracy, so this project reports practical accuracy-style measures. Accuracy Within Tolerance means the prediction is within $25K for small loans, $50K for medium loans, and $100K for large loans. Accuracy Within 25% means the prediction is within 25% of the actual approved amount.</w:t>
+      </w:r>
+    </w:p>
+    <w:tbl>
+      <w:tblPr>
+        <w:tblStyle w:val="TableGrid"/>
+        <w:tblW w:type="auto" w:w="0"/>
+        <w:jc w:val="center"/>
+        <w:tblLook w:firstColumn="1" w:firstRow="1" w:lastColumn="0" w:lastRow="0" w:noHBand="0" w:noVBand="1" w:val="04A0"/>
+      </w:tblPr>
+      <w:tblGrid>
+        <w:gridCol w:w="1260"/>
+        <w:gridCol w:w="1260"/>
+        <w:gridCol w:w="1260"/>
+        <w:gridCol w:w="1260"/>
+        <w:gridCol w:w="1260"/>
+        <w:gridCol w:w="1260"/>
+        <w:gridCol w:w="1260"/>
+        <w:gridCol w:w="1260"/>
+      </w:tblGrid>
+      <w:tr>
+        <w:tc>
+          <w:tcPr>
+            <w:tcW w:type="dxa" w:w="1260"/>
+            <w:vAlign w:val="center"/>
+            <w:shd w:fill="D9EAD3"/>
+          </w:tcPr>
+          <w:p>
+            <w:r/>
+            <w:r>
+              <w:rPr>
+                <w:b/>
+                <w:sz w:val="16"/>
+              </w:rPr>
+              <w:t>Split</w:t>
+            </w:r>
+          </w:p>
+        </w:tc>
+        <w:tc>
+          <w:tcPr>
+            <w:tcW w:type="dxa" w:w="1260"/>
+            <w:vAlign w:val="center"/>
+            <w:shd w:fill="D9EAD3"/>
+          </w:tcPr>
+          <w:p>
+            <w:r/>
+            <w:r>
+              <w:rPr>
+                <w:b/>
+                <w:sz w:val="16"/>
+              </w:rPr>
+              <w:t>Loan Size</w:t>
+            </w:r>
+          </w:p>
+        </w:tc>
+        <w:tc>
+          <w:tcPr>
+            <w:tcW w:type="dxa" w:w="1260"/>
+            <w:vAlign w:val="center"/>
+            <w:shd w:fill="D9EAD3"/>
+          </w:tcPr>
+          <w:p>
+            <w:r/>
+            <w:r>
+              <w:rPr>
+                <w:b/>
+                <w:sz w:val="16"/>
+              </w:rPr>
+              <w:t>Rows</w:t>
+            </w:r>
+          </w:p>
+        </w:tc>
+        <w:tc>
+          <w:tcPr>
+            <w:tcW w:type="dxa" w:w="1260"/>
+            <w:vAlign w:val="center"/>
+            <w:shd w:fill="D9EAD3"/>
+          </w:tcPr>
+          <w:p>
+            <w:r/>
+            <w:r>
+              <w:rPr>
+                <w:b/>
+                <w:sz w:val="16"/>
+              </w:rPr>
+              <w:t>MAE</w:t>
+            </w:r>
+          </w:p>
+        </w:tc>
+        <w:tc>
+          <w:tcPr>
+            <w:tcW w:type="dxa" w:w="1260"/>
+            <w:vAlign w:val="center"/>
+            <w:shd w:fill="D9EAD3"/>
+          </w:tcPr>
+          <w:p>
+            <w:r/>
+            <w:r>
+              <w:rPr>
+                <w:b/>
+                <w:sz w:val="16"/>
+              </w:rPr>
+              <w:t>RMSE</w:t>
+            </w:r>
+          </w:p>
+        </w:tc>
+        <w:tc>
+          <w:tcPr>
+            <w:tcW w:type="dxa" w:w="1260"/>
+            <w:vAlign w:val="center"/>
+            <w:shd w:fill="D9EAD3"/>
+          </w:tcPr>
+          <w:p>
+            <w:r/>
+            <w:r>
+              <w:rPr>
+                <w:b/>
+                <w:sz w:val="16"/>
+              </w:rPr>
+              <w:t>R2</w:t>
+            </w:r>
+          </w:p>
+        </w:tc>
+        <w:tc>
+          <w:tcPr>
+            <w:tcW w:type="dxa" w:w="1260"/>
+            <w:vAlign w:val="center"/>
+            <w:shd w:fill="D9EAD3"/>
+          </w:tcPr>
+          <w:p>
+            <w:r/>
+            <w:r>
+              <w:rPr>
+                <w:b/>
+                <w:sz w:val="16"/>
+              </w:rPr>
+              <w:t>Tol. Accuracy</w:t>
+            </w:r>
+          </w:p>
+        </w:tc>
+        <w:tc>
+          <w:tcPr>
+            <w:tcW w:type="dxa" w:w="1260"/>
+            <w:vAlign w:val="center"/>
+            <w:shd w:fill="D9EAD3"/>
+          </w:tcPr>
+          <w:p>
+            <w:r/>
+            <w:r>
+              <w:rPr>
+                <w:b/>
+                <w:sz w:val="16"/>
+              </w:rPr>
+              <w:t>25% Accuracy</w:t>
+            </w:r>
+          </w:p>
+        </w:tc>
+      </w:tr>
+      <w:tr>
+        <w:tc>
+          <w:tcPr>
+            <w:tcW w:type="dxa" w:w="1260"/>
+            <w:vAlign w:val="center"/>
+          </w:tcPr>
+          <w:p>
+            <w:r/>
+            <w:r>
+              <w:rPr>
+                <w:b w:val="0"/>
+                <w:sz w:val="16"/>
+              </w:rPr>
+              <w:t>Train</w:t>
+            </w:r>
+          </w:p>
+        </w:tc>
+        <w:tc>
+          <w:tcPr>
+            <w:tcW w:type="dxa" w:w="1260"/>
+            <w:vAlign w:val="center"/>
+          </w:tcPr>
+          <w:p>
+            <w:r/>
+            <w:r>
+              <w:rPr>
+                <w:b w:val="0"/>
+                <w:sz w:val="16"/>
+              </w:rPr>
+              <w:t>Small (&lt;$50K)</w:t>
+            </w:r>
+          </w:p>
+        </w:tc>
+        <w:tc>
+          <w:tcPr>
+            <w:tcW w:type="dxa" w:w="1260"/>
+            <w:vAlign w:val="center"/>
+          </w:tcPr>
+          <w:p>
+            <w:r/>
+            <w:r>
+              <w:rPr>
+                <w:b w:val="0"/>
+                <w:sz w:val="16"/>
+              </w:rPr>
+              <w:t>223397</w:t>
+            </w:r>
+          </w:p>
+        </w:tc>
+        <w:tc>
+          <w:tcPr>
+            <w:tcW w:type="dxa" w:w="1260"/>
+            <w:vAlign w:val="center"/>
+          </w:tcPr>
+          <w:p>
+            <w:r/>
+            <w:r>
+              <w:rPr>
+                <w:b w:val="0"/>
+                <w:sz w:val="16"/>
+              </w:rPr>
+              <w:t>$35,757</w:t>
+            </w:r>
+          </w:p>
+        </w:tc>
+        <w:tc>
+          <w:tcPr>
+            <w:tcW w:type="dxa" w:w="1260"/>
+            <w:vAlign w:val="center"/>
+          </w:tcPr>
+          <w:p>
+            <w:r/>
+            <w:r>
+              <w:rPr>
+                <w:b w:val="0"/>
+                <w:sz w:val="16"/>
+              </w:rPr>
+              <w:t>$58,275</w:t>
+            </w:r>
+          </w:p>
+        </w:tc>
+        <w:tc>
+          <w:tcPr>
+            <w:tcW w:type="dxa" w:w="1260"/>
+            <w:vAlign w:val="center"/>
+          </w:tcPr>
+          <w:p>
+            <w:r/>
+            <w:r>
+              <w:rPr>
+                <w:b w:val="0"/>
+                <w:sz w:val="16"/>
+              </w:rPr>
+              <w:t>-14.318</w:t>
+            </w:r>
+          </w:p>
+        </w:tc>
+        <w:tc>
+          <w:tcPr>
+            <w:tcW w:type="dxa" w:w="1260"/>
+            <w:vAlign w:val="center"/>
+          </w:tcPr>
+          <w:p>
+            <w:r/>
+            <w:r>
+              <w:rPr>
+                <w:b w:val="0"/>
+                <w:sz w:val="16"/>
+              </w:rPr>
+              <w:t>55.5%</w:t>
+            </w:r>
+          </w:p>
+        </w:tc>
+        <w:tc>
+          <w:tcPr>
+            <w:tcW w:type="dxa" w:w="1260"/>
+            <w:vAlign w:val="center"/>
+          </w:tcPr>
+          <w:p>
+            <w:r/>
+            <w:r>
+              <w:rPr>
+                <w:b w:val="0"/>
+                <w:sz w:val="16"/>
+              </w:rPr>
+              <w:t>18.1%</w:t>
+            </w:r>
+          </w:p>
+        </w:tc>
+      </w:tr>
+      <w:tr>
+        <w:tc>
+          <w:tcPr>
+            <w:tcW w:type="dxa" w:w="1260"/>
+            <w:vAlign w:val="center"/>
+          </w:tcPr>
+          <w:p>
+            <w:r/>
+            <w:r>
+              <w:rPr>
+                <w:b w:val="0"/>
+                <w:sz w:val="16"/>
+              </w:rPr>
+              <w:t>Train</w:t>
+            </w:r>
+          </w:p>
+        </w:tc>
+        <w:tc>
+          <w:tcPr>
+            <w:tcW w:type="dxa" w:w="1260"/>
+            <w:vAlign w:val="center"/>
+          </w:tcPr>
+          <w:p>
+            <w:r/>
+            <w:r>
+              <w:rPr>
+                <w:b w:val="0"/>
+                <w:sz w:val="16"/>
+              </w:rPr>
+              <w:t>Medium ($50K-$250K)</w:t>
+            </w:r>
+          </w:p>
+        </w:tc>
+        <w:tc>
+          <w:tcPr>
+            <w:tcW w:type="dxa" w:w="1260"/>
+            <w:vAlign w:val="center"/>
+          </w:tcPr>
+          <w:p>
+            <w:r/>
+            <w:r>
+              <w:rPr>
+                <w:b w:val="0"/>
+                <w:sz w:val="16"/>
+              </w:rPr>
+              <w:t>224933</w:t>
+            </w:r>
+          </w:p>
+        </w:tc>
+        <w:tc>
+          <w:tcPr>
+            <w:tcW w:type="dxa" w:w="1260"/>
+            <w:vAlign w:val="center"/>
+          </w:tcPr>
+          <w:p>
+            <w:r/>
+            <w:r>
+              <w:rPr>
+                <w:b w:val="0"/>
+                <w:sz w:val="16"/>
+              </w:rPr>
+              <w:t>$82,708</w:t>
+            </w:r>
+          </w:p>
+        </w:tc>
+        <w:tc>
+          <w:tcPr>
+            <w:tcW w:type="dxa" w:w="1260"/>
+            <w:vAlign w:val="center"/>
+          </w:tcPr>
+          <w:p>
+            <w:r/>
+            <w:r>
+              <w:rPr>
+                <w:b w:val="0"/>
+                <w:sz w:val="16"/>
+              </w:rPr>
+              <w:t>$123,567</w:t>
+            </w:r>
+          </w:p>
+        </w:tc>
+        <w:tc>
+          <w:tcPr>
+            <w:tcW w:type="dxa" w:w="1260"/>
+            <w:vAlign w:val="center"/>
+          </w:tcPr>
+          <w:p>
+            <w:r/>
+            <w:r>
+              <w:rPr>
+                <w:b w:val="0"/>
+                <w:sz w:val="16"/>
+              </w:rPr>
+              <w:t>-4.096</w:t>
+            </w:r>
+          </w:p>
+        </w:tc>
+        <w:tc>
+          <w:tcPr>
+            <w:tcW w:type="dxa" w:w="1260"/>
+            <w:vAlign w:val="center"/>
+          </w:tcPr>
+          <w:p>
+            <w:r/>
+            <w:r>
+              <w:rPr>
+                <w:b w:val="0"/>
+                <w:sz w:val="16"/>
+              </w:rPr>
+              <w:t>48.1%</w:t>
+            </w:r>
+          </w:p>
+        </w:tc>
+        <w:tc>
+          <w:tcPr>
+            <w:tcW w:type="dxa" w:w="1260"/>
+            <w:vAlign w:val="center"/>
+          </w:tcPr>
+          <w:p>
+            <w:r/>
+            <w:r>
+              <w:rPr>
+                <w:b w:val="0"/>
+                <w:sz w:val="16"/>
+              </w:rPr>
+              <w:t>29.1%</w:t>
+            </w:r>
+          </w:p>
+        </w:tc>
+      </w:tr>
+      <w:tr>
+        <w:tc>
+          <w:tcPr>
+            <w:tcW w:type="dxa" w:w="1260"/>
+            <w:vAlign w:val="center"/>
+          </w:tcPr>
+          <w:p>
+            <w:r/>
+            <w:r>
+              <w:rPr>
+                <w:b w:val="0"/>
+                <w:sz w:val="16"/>
+              </w:rPr>
+              <w:t>Train</w:t>
+            </w:r>
+          </w:p>
+        </w:tc>
+        <w:tc>
+          <w:tcPr>
+            <w:tcW w:type="dxa" w:w="1260"/>
+            <w:vAlign w:val="center"/>
+          </w:tcPr>
+          <w:p>
+            <w:r/>
+            <w:r>
+              <w:rPr>
+                <w:b w:val="0"/>
+                <w:sz w:val="16"/>
+              </w:rPr>
+              <w:t>Large (&gt;$250K)</w:t>
+            </w:r>
+          </w:p>
+        </w:tc>
+        <w:tc>
+          <w:tcPr>
+            <w:tcW w:type="dxa" w:w="1260"/>
+            <w:vAlign w:val="center"/>
+          </w:tcPr>
+          <w:p>
+            <w:r/>
+            <w:r>
+              <w:rPr>
+                <w:b w:val="0"/>
+                <w:sz w:val="16"/>
+              </w:rPr>
+              <w:t>127134</w:t>
+            </w:r>
+          </w:p>
+        </w:tc>
+        <w:tc>
+          <w:tcPr>
+            <w:tcW w:type="dxa" w:w="1260"/>
+            <w:vAlign w:val="center"/>
+          </w:tcPr>
+          <w:p>
+            <w:r/>
+            <w:r>
+              <w:rPr>
+                <w:b w:val="0"/>
+                <w:sz w:val="16"/>
+              </w:rPr>
+              <w:t>$233,496</w:t>
+            </w:r>
+          </w:p>
+        </w:tc>
+        <w:tc>
+          <w:tcPr>
+            <w:tcW w:type="dxa" w:w="1260"/>
+            <w:vAlign w:val="center"/>
+          </w:tcPr>
+          <w:p>
+            <w:r/>
+            <w:r>
+              <w:rPr>
+                <w:b w:val="0"/>
+                <w:sz w:val="16"/>
+              </w:rPr>
+              <w:t>$343,366</w:t>
+            </w:r>
+          </w:p>
+        </w:tc>
+        <w:tc>
+          <w:tcPr>
+            <w:tcW w:type="dxa" w:w="1260"/>
+            <w:vAlign w:val="center"/>
+          </w:tcPr>
+          <w:p>
+            <w:r/>
+            <w:r>
+              <w:rPr>
+                <w:b w:val="0"/>
+                <w:sz w:val="16"/>
+              </w:rPr>
+              <w:t>0.167</w:t>
+            </w:r>
+          </w:p>
+        </w:tc>
+        <w:tc>
+          <w:tcPr>
+            <w:tcW w:type="dxa" w:w="1260"/>
+            <w:vAlign w:val="center"/>
+          </w:tcPr>
+          <w:p>
+            <w:r/>
+            <w:r>
+              <w:rPr>
+                <w:b w:val="0"/>
+                <w:sz w:val="16"/>
+              </w:rPr>
+              <w:t>33.3%</w:t>
+            </w:r>
+          </w:p>
+        </w:tc>
+        <w:tc>
+          <w:tcPr>
+            <w:tcW w:type="dxa" w:w="1260"/>
+            <w:vAlign w:val="center"/>
+          </w:tcPr>
+          <w:p>
+            <w:r/>
+            <w:r>
+              <w:rPr>
+                <w:b w:val="0"/>
+                <w:sz w:val="16"/>
+              </w:rPr>
+              <w:t>37.1%</w:t>
+            </w:r>
+          </w:p>
+        </w:tc>
+      </w:tr>
+      <w:tr>
+        <w:tc>
+          <w:tcPr>
+            <w:tcW w:type="dxa" w:w="1260"/>
+            <w:vAlign w:val="center"/>
+          </w:tcPr>
+          <w:p>
+            <w:r/>
+            <w:r>
+              <w:rPr>
+                <w:b w:val="0"/>
+                <w:sz w:val="16"/>
+              </w:rPr>
+              <w:t>Validation</w:t>
+            </w:r>
+          </w:p>
+        </w:tc>
+        <w:tc>
+          <w:tcPr>
+            <w:tcW w:type="dxa" w:w="1260"/>
+            <w:vAlign w:val="center"/>
+          </w:tcPr>
+          <w:p>
+            <w:r/>
+            <w:r>
+              <w:rPr>
+                <w:b w:val="0"/>
+                <w:sz w:val="16"/>
+              </w:rPr>
+              <w:t>Small (&lt;$50K)</w:t>
+            </w:r>
+          </w:p>
+        </w:tc>
+        <w:tc>
+          <w:tcPr>
+            <w:tcW w:type="dxa" w:w="1260"/>
+            <w:vAlign w:val="center"/>
+          </w:tcPr>
+          <w:p>
+            <w:r/>
+            <w:r>
+              <w:rPr>
+                <w:b w:val="0"/>
+                <w:sz w:val="16"/>
+              </w:rPr>
+              <w:t>56006</w:t>
+            </w:r>
+          </w:p>
+        </w:tc>
+        <w:tc>
+          <w:tcPr>
+            <w:tcW w:type="dxa" w:w="1260"/>
+            <w:vAlign w:val="center"/>
+          </w:tcPr>
+          <w:p>
+            <w:r/>
+            <w:r>
+              <w:rPr>
+                <w:b w:val="0"/>
+                <w:sz w:val="16"/>
+              </w:rPr>
+              <w:t>$35,855</w:t>
+            </w:r>
+          </w:p>
+        </w:tc>
+        <w:tc>
+          <w:tcPr>
+            <w:tcW w:type="dxa" w:w="1260"/>
+            <w:vAlign w:val="center"/>
+          </w:tcPr>
+          <w:p>
+            <w:r/>
+            <w:r>
+              <w:rPr>
+                <w:b w:val="0"/>
+                <w:sz w:val="16"/>
+              </w:rPr>
+              <w:t>$58,847</w:t>
+            </w:r>
+          </w:p>
+        </w:tc>
+        <w:tc>
+          <w:tcPr>
+            <w:tcW w:type="dxa" w:w="1260"/>
+            <w:vAlign w:val="center"/>
+          </w:tcPr>
+          <w:p>
+            <w:r/>
+            <w:r>
+              <w:rPr>
+                <w:b w:val="0"/>
+                <w:sz w:val="16"/>
+              </w:rPr>
+              <w:t>-14.480</w:t>
+            </w:r>
+          </w:p>
+        </w:tc>
+        <w:tc>
+          <w:tcPr>
+            <w:tcW w:type="dxa" w:w="1260"/>
+            <w:vAlign w:val="center"/>
+          </w:tcPr>
+          <w:p>
+            <w:r/>
+            <w:r>
+              <w:rPr>
+                <w:b w:val="0"/>
+                <w:sz w:val="16"/>
+              </w:rPr>
+              <w:t>55.5%</w:t>
+            </w:r>
+          </w:p>
+        </w:tc>
+        <w:tc>
+          <w:tcPr>
+            <w:tcW w:type="dxa" w:w="1260"/>
+            <w:vAlign w:val="center"/>
+          </w:tcPr>
+          <w:p>
+            <w:r/>
+            <w:r>
+              <w:rPr>
+                <w:b w:val="0"/>
+                <w:sz w:val="16"/>
+              </w:rPr>
+              <w:t>18.3%</w:t>
+            </w:r>
+          </w:p>
+        </w:tc>
+      </w:tr>
+      <w:tr>
+        <w:tc>
+          <w:tcPr>
+            <w:tcW w:type="dxa" w:w="1260"/>
+            <w:vAlign w:val="center"/>
+          </w:tcPr>
+          <w:p>
+            <w:r/>
+            <w:r>
+              <w:rPr>
+                <w:b w:val="0"/>
+                <w:sz w:val="16"/>
+              </w:rPr>
+              <w:t>Validation</w:t>
+            </w:r>
+          </w:p>
+        </w:tc>
+        <w:tc>
+          <w:tcPr>
+            <w:tcW w:type="dxa" w:w="1260"/>
+            <w:vAlign w:val="center"/>
+          </w:tcPr>
+          <w:p>
+            <w:r/>
+            <w:r>
+              <w:rPr>
+                <w:b w:val="0"/>
+                <w:sz w:val="16"/>
+              </w:rPr>
+              <w:t>Medium ($50K-$250K)</w:t>
+            </w:r>
+          </w:p>
+        </w:tc>
+        <w:tc>
+          <w:tcPr>
+            <w:tcW w:type="dxa" w:w="1260"/>
+            <w:vAlign w:val="center"/>
+          </w:tcPr>
+          <w:p>
+            <w:r/>
+            <w:r>
+              <w:rPr>
+                <w:b w:val="0"/>
+                <w:sz w:val="16"/>
+              </w:rPr>
+              <w:t>56094</w:t>
+            </w:r>
+          </w:p>
+        </w:tc>
+        <w:tc>
+          <w:tcPr>
+            <w:tcW w:type="dxa" w:w="1260"/>
+            <w:vAlign w:val="center"/>
+          </w:tcPr>
+          <w:p>
+            <w:r/>
+            <w:r>
+              <w:rPr>
+                <w:b w:val="0"/>
+                <w:sz w:val="16"/>
+              </w:rPr>
+              <w:t>$83,606</w:t>
+            </w:r>
+          </w:p>
+        </w:tc>
+        <w:tc>
+          <w:tcPr>
+            <w:tcW w:type="dxa" w:w="1260"/>
+            <w:vAlign w:val="center"/>
+          </w:tcPr>
+          <w:p>
+            <w:r/>
+            <w:r>
+              <w:rPr>
+                <w:b w:val="0"/>
+                <w:sz w:val="16"/>
+              </w:rPr>
+              <w:t>$125,396</w:t>
+            </w:r>
+          </w:p>
+        </w:tc>
+        <w:tc>
+          <w:tcPr>
+            <w:tcW w:type="dxa" w:w="1260"/>
+            <w:vAlign w:val="center"/>
+          </w:tcPr>
+          <w:p>
+            <w:r/>
+            <w:r>
+              <w:rPr>
+                <w:b w:val="0"/>
+                <w:sz w:val="16"/>
+              </w:rPr>
+              <w:t>-4.237</w:t>
+            </w:r>
+          </w:p>
+        </w:tc>
+        <w:tc>
+          <w:tcPr>
+            <w:tcW w:type="dxa" w:w="1260"/>
+            <w:vAlign w:val="center"/>
+          </w:tcPr>
+          <w:p>
+            <w:r/>
+            <w:r>
+              <w:rPr>
+                <w:b w:val="0"/>
+                <w:sz w:val="16"/>
+              </w:rPr>
+              <w:t>47.6%</w:t>
+            </w:r>
+          </w:p>
+        </w:tc>
+        <w:tc>
+          <w:tcPr>
+            <w:tcW w:type="dxa" w:w="1260"/>
+            <w:vAlign w:val="center"/>
+          </w:tcPr>
+          <w:p>
+            <w:r/>
+            <w:r>
+              <w:rPr>
+                <w:b w:val="0"/>
+                <w:sz w:val="16"/>
+              </w:rPr>
+              <w:t>28.9%</w:t>
+            </w:r>
+          </w:p>
+        </w:tc>
+      </w:tr>
+      <w:tr>
+        <w:tc>
+          <w:tcPr>
+            <w:tcW w:type="dxa" w:w="1260"/>
+            <w:vAlign w:val="center"/>
+          </w:tcPr>
+          <w:p>
+            <w:r/>
+            <w:r>
+              <w:rPr>
+                <w:b w:val="0"/>
+                <w:sz w:val="16"/>
+              </w:rPr>
+              <w:t>Validation</w:t>
+            </w:r>
+          </w:p>
+        </w:tc>
+        <w:tc>
+          <w:tcPr>
+            <w:tcW w:type="dxa" w:w="1260"/>
+            <w:vAlign w:val="center"/>
+          </w:tcPr>
+          <w:p>
+            <w:r/>
+            <w:r>
+              <w:rPr>
+                <w:b w:val="0"/>
+                <w:sz w:val="16"/>
+              </w:rPr>
+              <w:t>Large (&gt;$250K)</w:t>
+            </w:r>
+          </w:p>
+        </w:tc>
+        <w:tc>
+          <w:tcPr>
+            <w:tcW w:type="dxa" w:w="1260"/>
+            <w:vAlign w:val="center"/>
+          </w:tcPr>
+          <w:p>
+            <w:r/>
+            <w:r>
+              <w:rPr>
+                <w:b w:val="0"/>
+                <w:sz w:val="16"/>
+              </w:rPr>
+              <w:t>31767</w:t>
+            </w:r>
+          </w:p>
+        </w:tc>
+        <w:tc>
+          <w:tcPr>
+            <w:tcW w:type="dxa" w:w="1260"/>
+            <w:vAlign w:val="center"/>
+          </w:tcPr>
+          <w:p>
+            <w:r/>
+            <w:r>
+              <w:rPr>
+                <w:b w:val="0"/>
+                <w:sz w:val="16"/>
+              </w:rPr>
+              <w:t>$236,906</w:t>
+            </w:r>
+          </w:p>
+        </w:tc>
+        <w:tc>
+          <w:tcPr>
+            <w:tcW w:type="dxa" w:w="1260"/>
+            <w:vAlign w:val="center"/>
+          </w:tcPr>
+          <w:p>
+            <w:r/>
+            <w:r>
+              <w:rPr>
+                <w:b w:val="0"/>
+                <w:sz w:val="16"/>
+              </w:rPr>
+              <w:t>$349,393</w:t>
+            </w:r>
+          </w:p>
+        </w:tc>
+        <w:tc>
+          <w:tcPr>
+            <w:tcW w:type="dxa" w:w="1260"/>
+            <w:vAlign w:val="center"/>
+          </w:tcPr>
+          <w:p>
+            <w:r/>
+            <w:r>
+              <w:rPr>
+                <w:b w:val="0"/>
+                <w:sz w:val="16"/>
+              </w:rPr>
+              <w:t>0.122</w:t>
+            </w:r>
+          </w:p>
+        </w:tc>
+        <w:tc>
+          <w:tcPr>
+            <w:tcW w:type="dxa" w:w="1260"/>
+            <w:vAlign w:val="center"/>
+          </w:tcPr>
+          <w:p>
+            <w:r/>
+            <w:r>
+              <w:rPr>
+                <w:b w:val="0"/>
+                <w:sz w:val="16"/>
+              </w:rPr>
+              <w:t>33.1%</w:t>
+            </w:r>
+          </w:p>
+        </w:tc>
+        <w:tc>
+          <w:tcPr>
+            <w:tcW w:type="dxa" w:w="1260"/>
+            <w:vAlign w:val="center"/>
+          </w:tcPr>
+          <w:p>
+            <w:r/>
+            <w:r>
+              <w:rPr>
+                <w:b w:val="0"/>
+                <w:sz w:val="16"/>
+              </w:rPr>
+              <w:t>36.7%</w:t>
+            </w:r>
+          </w:p>
+        </w:tc>
+      </w:tr>
+      <w:tr>
+        <w:tc>
+          <w:tcPr>
+            <w:tcW w:type="dxa" w:w="1260"/>
+            <w:vAlign w:val="center"/>
+          </w:tcPr>
+          <w:p>
+            <w:r/>
+            <w:r>
+              <w:rPr>
+                <w:b w:val="0"/>
+                <w:sz w:val="16"/>
+              </w:rPr>
+              <w:t>Test</w:t>
+            </w:r>
+          </w:p>
+        </w:tc>
+        <w:tc>
+          <w:tcPr>
+            <w:tcW w:type="dxa" w:w="1260"/>
+            <w:vAlign w:val="center"/>
+          </w:tcPr>
+          <w:p>
+            <w:r/>
+            <w:r>
+              <w:rPr>
+                <w:b w:val="0"/>
+                <w:sz w:val="16"/>
+              </w:rPr>
+              <w:t>Small (&lt;$50K)</w:t>
+            </w:r>
+          </w:p>
+        </w:tc>
+        <w:tc>
+          <w:tcPr>
+            <w:tcW w:type="dxa" w:w="1260"/>
+            <w:vAlign w:val="center"/>
+          </w:tcPr>
+          <w:p>
+            <w:r/>
+            <w:r>
+              <w:rPr>
+                <w:b w:val="0"/>
+                <w:sz w:val="16"/>
+              </w:rPr>
+              <w:t>69933</w:t>
+            </w:r>
+          </w:p>
+        </w:tc>
+        <w:tc>
+          <w:tcPr>
+            <w:tcW w:type="dxa" w:w="1260"/>
+            <w:vAlign w:val="center"/>
+          </w:tcPr>
+          <w:p>
+            <w:r/>
+            <w:r>
+              <w:rPr>
+                <w:b w:val="0"/>
+                <w:sz w:val="16"/>
+              </w:rPr>
+              <w:t>$35,805</w:t>
+            </w:r>
+          </w:p>
+        </w:tc>
+        <w:tc>
+          <w:tcPr>
+            <w:tcW w:type="dxa" w:w="1260"/>
+            <w:vAlign w:val="center"/>
+          </w:tcPr>
+          <w:p>
+            <w:r/>
+            <w:r>
+              <w:rPr>
+                <w:b w:val="0"/>
+                <w:sz w:val="16"/>
+              </w:rPr>
+              <w:t>$59,072</w:t>
+            </w:r>
+          </w:p>
+        </w:tc>
+        <w:tc>
+          <w:tcPr>
+            <w:tcW w:type="dxa" w:w="1260"/>
+            <w:vAlign w:val="center"/>
+          </w:tcPr>
+          <w:p>
+            <w:r/>
+            <w:r>
+              <w:rPr>
+                <w:b w:val="0"/>
+                <w:sz w:val="16"/>
+              </w:rPr>
+              <w:t>-14.673</w:t>
+            </w:r>
+          </w:p>
+        </w:tc>
+        <w:tc>
+          <w:tcPr>
+            <w:tcW w:type="dxa" w:w="1260"/>
+            <w:vAlign w:val="center"/>
+          </w:tcPr>
+          <w:p>
+            <w:r/>
+            <w:r>
+              <w:rPr>
+                <w:b w:val="0"/>
+                <w:sz w:val="16"/>
+              </w:rPr>
+              <w:t>55.3%</w:t>
+            </w:r>
+          </w:p>
+        </w:tc>
+        <w:tc>
+          <w:tcPr>
+            <w:tcW w:type="dxa" w:w="1260"/>
+            <w:vAlign w:val="center"/>
+          </w:tcPr>
+          <w:p>
+            <w:r/>
+            <w:r>
+              <w:rPr>
+                <w:b w:val="0"/>
+                <w:sz w:val="16"/>
+              </w:rPr>
+              <w:t>18.1%</w:t>
+            </w:r>
+          </w:p>
+        </w:tc>
+      </w:tr>
+      <w:tr>
+        <w:tc>
+          <w:tcPr>
+            <w:tcW w:type="dxa" w:w="1260"/>
+            <w:vAlign w:val="center"/>
+          </w:tcPr>
+          <w:p>
+            <w:r/>
+            <w:r>
+              <w:rPr>
+                <w:b w:val="0"/>
+                <w:sz w:val="16"/>
+              </w:rPr>
+              <w:t>Test</w:t>
+            </w:r>
+          </w:p>
+        </w:tc>
+        <w:tc>
+          <w:tcPr>
+            <w:tcW w:type="dxa" w:w="1260"/>
+            <w:vAlign w:val="center"/>
+          </w:tcPr>
+          <w:p>
+            <w:r/>
+            <w:r>
+              <w:rPr>
+                <w:b w:val="0"/>
+                <w:sz w:val="16"/>
+              </w:rPr>
+              <w:t>Medium ($50K-$250K)</w:t>
+            </w:r>
+          </w:p>
+        </w:tc>
+        <w:tc>
+          <w:tcPr>
+            <w:tcW w:type="dxa" w:w="1260"/>
+            <w:vAlign w:val="center"/>
+          </w:tcPr>
+          <w:p>
+            <w:r/>
+            <w:r>
+              <w:rPr>
+                <w:b w:val="0"/>
+                <w:sz w:val="16"/>
+              </w:rPr>
+              <w:t>70098</w:t>
+            </w:r>
+          </w:p>
+        </w:tc>
+        <w:tc>
+          <w:tcPr>
+            <w:tcW w:type="dxa" w:w="1260"/>
+            <w:vAlign w:val="center"/>
+          </w:tcPr>
+          <w:p>
+            <w:r/>
+            <w:r>
+              <w:rPr>
+                <w:b w:val="0"/>
+                <w:sz w:val="16"/>
+              </w:rPr>
+              <w:t>$83,430</w:t>
+            </w:r>
+          </w:p>
+        </w:tc>
+        <w:tc>
+          <w:tcPr>
+            <w:tcW w:type="dxa" w:w="1260"/>
+            <w:vAlign w:val="center"/>
+          </w:tcPr>
+          <w:p>
+            <w:r/>
+            <w:r>
+              <w:rPr>
+                <w:b w:val="0"/>
+                <w:sz w:val="16"/>
+              </w:rPr>
+              <w:t>$125,453</w:t>
+            </w:r>
+          </w:p>
+        </w:tc>
+        <w:tc>
+          <w:tcPr>
+            <w:tcW w:type="dxa" w:w="1260"/>
+            <w:vAlign w:val="center"/>
+          </w:tcPr>
+          <w:p>
+            <w:r/>
+            <w:r>
+              <w:rPr>
+                <w:b w:val="0"/>
+                <w:sz w:val="16"/>
+              </w:rPr>
+              <w:t>-4.256</w:t>
+            </w:r>
+          </w:p>
+        </w:tc>
+        <w:tc>
+          <w:tcPr>
+            <w:tcW w:type="dxa" w:w="1260"/>
+            <w:vAlign w:val="center"/>
+          </w:tcPr>
+          <w:p>
+            <w:r/>
+            <w:r>
+              <w:rPr>
+                <w:b w:val="0"/>
+                <w:sz w:val="16"/>
+              </w:rPr>
+              <w:t>48.0%</w:t>
+            </w:r>
+          </w:p>
+        </w:tc>
+        <w:tc>
+          <w:tcPr>
+            <w:tcW w:type="dxa" w:w="1260"/>
+            <w:vAlign w:val="center"/>
+          </w:tcPr>
+          <w:p>
+            <w:r/>
+            <w:r>
+              <w:rPr>
+                <w:b w:val="0"/>
+                <w:sz w:val="16"/>
+              </w:rPr>
+              <w:t>29.0%</w:t>
+            </w:r>
+          </w:p>
+        </w:tc>
+      </w:tr>
+      <w:tr>
+        <w:tc>
+          <w:tcPr>
+            <w:tcW w:type="dxa" w:w="1260"/>
+            <w:vAlign w:val="center"/>
+          </w:tcPr>
+          <w:p>
+            <w:r/>
+            <w:r>
+              <w:rPr>
+                <w:b w:val="0"/>
+                <w:sz w:val="16"/>
+              </w:rPr>
+              <w:t>Test</w:t>
+            </w:r>
+          </w:p>
+        </w:tc>
+        <w:tc>
+          <w:tcPr>
+            <w:tcW w:type="dxa" w:w="1260"/>
+            <w:vAlign w:val="center"/>
+          </w:tcPr>
+          <w:p>
+            <w:r/>
+            <w:r>
+              <w:rPr>
+                <w:b w:val="0"/>
+                <w:sz w:val="16"/>
+              </w:rPr>
+              <w:t>Large (&gt;$250K)</w:t>
+            </w:r>
+          </w:p>
+        </w:tc>
+        <w:tc>
+          <w:tcPr>
+            <w:tcW w:type="dxa" w:w="1260"/>
+            <w:vAlign w:val="center"/>
+          </w:tcPr>
+          <w:p>
+            <w:r/>
+            <w:r>
+              <w:rPr>
+                <w:b w:val="0"/>
+                <w:sz w:val="16"/>
+              </w:rPr>
+              <w:t>39802</w:t>
+            </w:r>
+          </w:p>
+        </w:tc>
+        <w:tc>
+          <w:tcPr>
+            <w:tcW w:type="dxa" w:w="1260"/>
+            <w:vAlign w:val="center"/>
+          </w:tcPr>
+          <w:p>
+            <w:r/>
+            <w:r>
+              <w:rPr>
+                <w:b w:val="0"/>
+                <w:sz w:val="16"/>
+              </w:rPr>
+              <w:t>$236,515</w:t>
+            </w:r>
+          </w:p>
+        </w:tc>
+        <w:tc>
+          <w:tcPr>
+            <w:tcW w:type="dxa" w:w="1260"/>
+            <w:vAlign w:val="center"/>
+          </w:tcPr>
+          <w:p>
+            <w:r/>
+            <w:r>
+              <w:rPr>
+                <w:b w:val="0"/>
+                <w:sz w:val="16"/>
+              </w:rPr>
+              <w:t>$347,369</w:t>
+            </w:r>
+          </w:p>
+        </w:tc>
+        <w:tc>
+          <w:tcPr>
+            <w:tcW w:type="dxa" w:w="1260"/>
+            <w:vAlign w:val="center"/>
+          </w:tcPr>
+          <w:p>
+            <w:r/>
+            <w:r>
+              <w:rPr>
+                <w:b w:val="0"/>
+                <w:sz w:val="16"/>
+              </w:rPr>
+              <w:t>0.135</w:t>
+            </w:r>
+          </w:p>
+        </w:tc>
+        <w:tc>
+          <w:tcPr>
+            <w:tcW w:type="dxa" w:w="1260"/>
+            <w:vAlign w:val="center"/>
+          </w:tcPr>
+          <w:p>
+            <w:r/>
+            <w:r>
+              <w:rPr>
+                <w:b w:val="0"/>
+                <w:sz w:val="16"/>
+              </w:rPr>
+              <w:t>33.1%</w:t>
+            </w:r>
+          </w:p>
+        </w:tc>
+        <w:tc>
+          <w:tcPr>
+            <w:tcW w:type="dxa" w:w="1260"/>
+            <w:vAlign w:val="center"/>
+          </w:tcPr>
+          <w:p>
+            <w:r/>
+            <w:r>
+              <w:rPr>
+                <w:b w:val="0"/>
+                <w:sz w:val="16"/>
+              </w:rPr>
+              <w:t>36.4%</w:t>
+            </w:r>
+          </w:p>
+        </w:tc>
+      </w:tr>
+    </w:tbl>
+    <w:p/>
+    <w:p>
+      <w:pPr>
+        <w:jc w:val="center"/>
+      </w:pPr>
+      <w:r>
+        <w:drawing>
+          <wp:inline xmlns:a="http://schemas.openxmlformats.org/drawingml/2006/main" xmlns:pic="http://schemas.openxmlformats.org/drawingml/2006/picture">
+            <wp:extent cx="5852160" cy="1913914"/>
+            <wp:docPr id="8" name="Picture 8"/>
+            <wp:cNvGraphicFramePr>
+              <a:graphicFrameLocks noChangeAspect="1"/>
+            </wp:cNvGraphicFramePr>
+            <a:graphic>
+              <a:graphicData uri="http://schemas.openxmlformats.org/drawingml/2006/picture">
+                <pic:pic>
+                  <pic:nvPicPr>
+                    <pic:cNvPr id="0" name="loan_size_accuracy_by_split.png"/>
+                    <pic:cNvPicPr/>
+                  </pic:nvPicPr>
+                  <pic:blipFill>
+                    <a:blip r:embed="rId16"/>
+                    <a:stretch>
+                      <a:fillRect/>
+                    </a:stretch>
+                  </pic:blipFill>
+                  <pic:spPr>
+                    <a:xfrm>
+                      <a:off x="0" y="0"/>
+                      <a:ext cx="5852160" cy="1913914"/>
+                    </a:xfrm>
+                    <a:prstGeom prst="rect"/>
+                  </pic:spPr>
+                </pic:pic>
+              </a:graphicData>
+            </a:graphic>
+          </wp:inline>
+        </w:drawing>
+      </w:r>
+    </w:p>
+    <w:p>
+      <w:pPr>
+        <w:jc w:val="center"/>
+      </w:pPr>
+      <w:r>
+        <w:rPr>
+          <w:i/>
+          <w:sz w:val="18"/>
+        </w:rPr>
+        <w:t>Figure 8. LightGBM train, validation, and test accuracy by loan size.</w:t>
+      </w:r>
+    </w:p>
+    <w:p>
+      <w:r>
+        <w:t>The train, validation, and test values are very close. This means the main problem is not overfitting. Instead, the model is biased toward middle loan amounts and lacks enough high-signal borrower information to make precise predictions at the extremes.</w:t>
       </w:r>
     </w:p>
     <w:sectPr>
@@ -1984,7 +3819,7 @@
       <w:outlineLvl w:val="0"/>
     </w:pPr>
     <w:rPr>
-      <w:rFonts w:asciiTheme="majorHAnsi" w:eastAsiaTheme="majorEastAsia" w:hAnsiTheme="majorHAnsi" w:cstheme="majorBidi" w:ascii="Calibri" w:hAnsi="Calibri"/>
+      <w:rFonts w:asciiTheme="majorHAnsi" w:eastAsiaTheme="majorEastAsia" w:hAnsiTheme="majorHAnsi" w:cstheme="majorBidi"/>
       <w:b/>
       <w:bCs/>
       <w:color w:val="365F91" w:themeColor="accent1" w:themeShade="BF"/>
@@ -2008,7 +3843,7 @@
       <w:outlineLvl w:val="1"/>
     </w:pPr>
     <w:rPr>
-      <w:rFonts w:asciiTheme="majorHAnsi" w:eastAsiaTheme="majorEastAsia" w:hAnsiTheme="majorHAnsi" w:cstheme="majorBidi" w:ascii="Calibri" w:hAnsi="Calibri"/>
+      <w:rFonts w:asciiTheme="majorHAnsi" w:eastAsiaTheme="majorEastAsia" w:hAnsiTheme="majorHAnsi" w:cstheme="majorBidi"/>
       <w:b/>
       <w:bCs/>
       <w:color w:val="4F81BD" w:themeColor="accent1"/>
@@ -2273,7 +4108,7 @@
       <w:contextualSpacing/>
     </w:pPr>
     <w:rPr>
-      <w:rFonts w:asciiTheme="majorHAnsi" w:eastAsiaTheme="majorEastAsia" w:hAnsiTheme="majorHAnsi" w:cstheme="majorBidi" w:ascii="Calibri" w:hAnsi="Calibri"/>
+      <w:rFonts w:asciiTheme="majorHAnsi" w:eastAsiaTheme="majorEastAsia" w:hAnsiTheme="majorHAnsi" w:cstheme="majorBidi"/>
       <w:color w:val="17365D" w:themeColor="text2" w:themeShade="BF"/>
       <w:spacing w:val="5"/>
       <w:kern w:val="28"/>

</xml_diff>